<commit_message>
Expand recent experience in ZFORT and IT Delight CVs
</commit_message>
<xml_diff>
--- a/registry/jobs/2026-09-23_135953_it-delight_senior-go-developer/application/CV_ValentinNikolaev_itdelight_SeniorGoDeveloper.docx
+++ b/registry/jobs/2026-09-23_135953_it-delight_senior-go-developer/application/CV_ValentinNikolaev_itdelight_SeniorGoDeveloper.docx
@@ -12,7 +12,6 @@
       <w:bookmarkStart w:name="_Toc_Valentin_Nikolaev_1" w:id="1"/>
       <w:r>
         <w:rPr>
-          <w:rFonts w:ascii="Aptos" w:cs="Aptos" w:eastAsia="Aptos" w:hAnsi="Aptos"/>
           <w:color w:val="000000"/>
           <w:sz w:val="32"/>
           <w:szCs w:val="32"/>
@@ -25,12 +24,11 @@
     <w:p>
       <w:pPr>
         <w:bidi w:val="false"/>
-        <w:spacing w:after="120" w:before="120" w:line="259.20000000000005"/>
+        <w:spacing w:after="240" w:before="240" w:line="276"/>
         <w:jc w:val="left"/>
       </w:pPr>
       <w:r>
         <w:rPr>
-          <w:rFonts w:ascii="Aptos" w:cs="Aptos" w:eastAsia="Aptos" w:hAnsi="Aptos"/>
           <w:color w:val="000000"/>
           <w:sz w:val="24"/>
           <w:szCs w:val="24"/>
@@ -42,12 +40,11 @@
     <w:p>
       <w:pPr>
         <w:bidi w:val="false"/>
-        <w:spacing w:after="120" w:before="120" w:line="259.20000000000005"/>
+        <w:spacing w:after="240" w:before="240" w:line="276"/>
         <w:jc w:val="left"/>
       </w:pPr>
       <w:r>
         <w:rPr>
-          <w:rFonts w:ascii="Aptos" w:cs="Aptos" w:eastAsia="Aptos" w:hAnsi="Aptos"/>
           <w:color w:val="000000"/>
           <w:sz w:val="24"/>
           <w:szCs w:val="24"/>
@@ -55,10 +52,9 @@
         </w:rPr>
         <w:t xml:space="preserve">Rome, Italy | +39 351 370 1194 | </w:t>
       </w:r>
-      <w:hyperlink w:history="1" r:id="rIdhirw4cpwcalv1w6nmypij">
+      <w:hyperlink w:history="1" r:id="rIdtgf8b_bxkeetxu_cdreec">
         <w:r>
           <w:rPr>
-            <w:rFonts w:ascii="Aptos" w:cs="Aptos" w:eastAsia="Aptos" w:hAnsi="Aptos"/>
             <w:color w:val="0000FF"/>
             <w:sz w:val="24"/>
             <w:szCs w:val="24"/>
@@ -70,7 +66,6 @@
       </w:hyperlink>
       <w:r>
         <w:rPr>
-          <w:rFonts w:ascii="Aptos" w:cs="Aptos" w:eastAsia="Aptos" w:hAnsi="Aptos"/>
           <w:color w:val="000000"/>
           <w:sz w:val="24"/>
           <w:szCs w:val="24"/>
@@ -81,7 +76,6 @@
       </w:r>
       <w:r>
         <w:rPr>
-          <w:rFonts w:ascii="Aptos" w:cs="Aptos" w:eastAsia="Aptos" w:hAnsi="Aptos"/>
           <w:color w:val="000000"/>
           <w:sz w:val="24"/>
           <w:szCs w:val="24"/>
@@ -89,10 +83,9 @@
         </w:rPr>
         <w:t xml:space="preserve">LinkedIn: </w:t>
       </w:r>
-      <w:hyperlink w:history="1" r:id="rIdrnmasbozrhy2yjw9zv0vd">
+      <w:hyperlink w:history="1" r:id="rIdcx4gw2_6z_tz1s9peszzj">
         <w:r>
           <w:rPr>
-            <w:rFonts w:ascii="Aptos" w:cs="Aptos" w:eastAsia="Aptos" w:hAnsi="Aptos"/>
             <w:color w:val="0000FF"/>
             <w:sz w:val="24"/>
             <w:szCs w:val="24"/>
@@ -104,7 +97,6 @@
       </w:hyperlink>
       <w:r>
         <w:rPr>
-          <w:rFonts w:ascii="Aptos" w:cs="Aptos" w:eastAsia="Aptos" w:hAnsi="Aptos"/>
           <w:color w:val="000000"/>
           <w:sz w:val="24"/>
           <w:szCs w:val="24"/>
@@ -112,10 +104,9 @@
         </w:rPr>
         <w:t xml:space="preserve"> | GitHub: </w:t>
       </w:r>
-      <w:hyperlink w:history="1" r:id="rId__qyx-9lrn6_h27vcukof">
+      <w:hyperlink w:history="1" r:id="rId7zdhp0edytg6sknobeqva">
         <w:r>
           <w:rPr>
-            <w:rFonts w:ascii="Aptos" w:cs="Aptos" w:eastAsia="Aptos" w:hAnsi="Aptos"/>
             <w:color w:val="0000FF"/>
             <w:sz w:val="24"/>
             <w:szCs w:val="24"/>
@@ -136,7 +127,6 @@
       <w:bookmarkStart w:name="_Toc_Summary_2" w:id="1"/>
       <w:r>
         <w:rPr>
-          <w:rFonts w:ascii="Aptos" w:cs="Aptos" w:eastAsia="Aptos" w:hAnsi="Aptos"/>
           <w:color w:val="000000"/>
           <w:sz w:val="28"/>
           <w:szCs w:val="28"/>
@@ -149,18 +139,17 @@
     <w:p>
       <w:pPr>
         <w:bidi w:val="false"/>
-        <w:spacing w:after="120" w:before="120" w:line="259.20000000000005"/>
+        <w:spacing w:after="240" w:before="240" w:line="276"/>
         <w:jc w:val="left"/>
       </w:pPr>
       <w:r>
         <w:rPr>
-          <w:rFonts w:ascii="Aptos" w:cs="Aptos" w:eastAsia="Aptos" w:hAnsi="Aptos"/>
-          <w:color w:val="000000"/>
-          <w:sz w:val="24"/>
-          <w:szCs w:val="24"/>
-          <w:rtl w:val="false"/>
-        </w:rPr>
-        <w:t xml:space="preserve">Backend engineer with more than 15 years of experience building reliable production systems across Go and PHP. Recent work includes auto-triage flows automating or deflecting up to 30% of inbound tickets and database work improving service stability during high-traffic periods. My experience spans REST APIs, microservice and serverless architecture, technical leadership, transactional email, and platform delivery from prototype through closed beta. I combine hands-on backend delivery with platform planning, focusing on maintainable services, pragmatic integrations, and operationally practical architecture for products. I bring experience across support automation, communication systems, product delivery, backend reliability, and technical decision-making with delivery stakeholders. I prefer measurable outcomes and operational feedback under changing production constraints.</w:t>
+          <w:color w:val="000000"/>
+          <w:sz w:val="24"/>
+          <w:szCs w:val="24"/>
+          <w:rtl w:val="false"/>
+        </w:rPr>
+        <w:t xml:space="preserve">Backend engineer with 15+ years of experience delivering Go and PHP services, integrations, and high-load communication systems. Over the past five years I have worked on support automation, database stability, service observability, and backend delivery from planning through production. I combine hands-on development with technical leadership, focusing on clear service boundaries, reliable operations, and changes that solve a measured product or support problem. Earlier work adds experience leading an email-platform team through high-demand periods and taking a product from prototype to closed beta.</w:t>
       </w:r>
     </w:p>
     <w:p>
@@ -173,7 +162,6 @@
       <w:bookmarkStart w:name="_Toc_Skills_3" w:id="1"/>
       <w:r>
         <w:rPr>
-          <w:rFonts w:ascii="Aptos" w:cs="Aptos" w:eastAsia="Aptos" w:hAnsi="Aptos"/>
           <w:color w:val="000000"/>
           <w:sz w:val="28"/>
           <w:szCs w:val="28"/>
@@ -186,18 +174,17 @@
     <w:p>
       <w:pPr>
         <w:bidi w:val="false"/>
-        <w:spacing w:after="120" w:before="120" w:line="259.20000000000005"/>
+        <w:spacing w:after="240" w:before="240" w:line="276"/>
         <w:jc w:val="left"/>
       </w:pPr>
       <w:r>
         <w:rPr>
-          <w:rFonts w:ascii="Aptos" w:cs="Aptos" w:eastAsia="Aptos" w:hAnsi="Aptos"/>
-          <w:color w:val="000000"/>
-          <w:sz w:val="24"/>
-          <w:szCs w:val="24"/>
-          <w:rtl w:val="false"/>
-        </w:rPr>
-        <w:t xml:space="preserve">Go; PHP; REST APIs; microservices; backend integrations; event-driven systems; MySQL; PostgreSQL; RabbitMQ; AWS; GitHub Actions; Laravel; monitoring, logging, and observability.</w:t>
+          <w:color w:val="000000"/>
+          <w:sz w:val="24"/>
+          <w:szCs w:val="24"/>
+          <w:rtl w:val="false"/>
+        </w:rPr>
+        <w:t xml:space="preserve">Go; PHP; REST APIs; microservices; backend integrations; event-driven systems; MySQL; PostgreSQL; RabbitMQ; AWS; Laravel; Symfony; GitHub Actions; monitoring and logging; system design; performance optimization; CI/CD.</w:t>
       </w:r>
     </w:p>
     <w:p>
@@ -207,52 +194,14 @@
         <w:bidi w:val="false"/>
         <w:spacing w:after="120" w:before="240"/>
       </w:pPr>
-      <w:bookmarkStart w:name="_Toc_Engineering_Focus_4" w:id="1"/>
-      <w:r>
-        <w:rPr>
-          <w:rFonts w:ascii="Aptos" w:cs="Aptos" w:eastAsia="Aptos" w:hAnsi="Aptos"/>
+      <w:bookmarkStart w:name="_Toc_Experience_4" w:id="1"/>
+      <w:r>
+        <w:rPr>
           <w:color w:val="000000"/>
           <w:sz w:val="28"/>
           <w:szCs w:val="28"/>
           <w:rtl w:val="false"/>
         </w:rPr>
-        <w:t xml:space="preserve">Engineering Focus</w:t>
-      </w:r>
-      <w:bookmarkEnd w:id="1"/>
-    </w:p>
-    <w:p>
-      <w:pPr>
-        <w:bidi w:val="false"/>
-        <w:spacing w:after="120" w:before="120" w:line="259.20000000000005"/>
-        <w:jc w:val="left"/>
-      </w:pPr>
-      <w:r>
-        <w:rPr>
-          <w:rFonts w:ascii="Aptos" w:cs="Aptos" w:eastAsia="Aptos" w:hAnsi="Aptos"/>
-          <w:color w:val="000000"/>
-          <w:sz w:val="24"/>
-          <w:szCs w:val="24"/>
-          <w:rtl w:val="false"/>
-        </w:rPr>
-        <w:t xml:space="preserve">Production backend platforms; customer-operations automation; transactional email; service integrations; database stability; high-load systems; microservice design; serverless architecture; CI/CD; delivery planning; technology roadmaps; reliability and serviceability; performance optimization; observability; messaging systems; REST; service ownership; operational troubleshooting; pragmatic system design.</w:t>
-      </w:r>
-    </w:p>
-    <w:p>
-      <w:pPr>
-        <w:pStyle w:val="2"/>
-        <w:pStyle w:val="Heading2"/>
-        <w:bidi w:val="false"/>
-        <w:spacing w:after="120" w:before="240"/>
-      </w:pPr>
-      <w:bookmarkStart w:name="_Toc_Experience_5" w:id="1"/>
-      <w:r>
-        <w:rPr>
-          <w:rFonts w:ascii="Aptos" w:cs="Aptos" w:eastAsia="Aptos" w:hAnsi="Aptos"/>
-          <w:color w:val="000000"/>
-          <w:sz w:val="28"/>
-          <w:szCs w:val="28"/>
-          <w:rtl w:val="false"/>
-        </w:rPr>
         <w:t xml:space="preserve">Experience</w:t>
       </w:r>
       <w:bookmarkEnd w:id="1"/>
@@ -264,10 +213,9 @@
         <w:bidi w:val="false"/>
         <w:spacing w:after="120" w:before="240"/>
       </w:pPr>
-      <w:bookmarkStart w:name="_Toc_Simplelife_Software_Developer_November_2_6" w:id="1"/>
-      <w:r>
-        <w:rPr>
-          <w:rFonts w:ascii="Aptos" w:cs="Aptos" w:eastAsia="Aptos" w:hAnsi="Aptos"/>
+      <w:bookmarkStart w:name="_Toc_Simplelife_Software_Developer_November_2_5" w:id="1"/>
+      <w:r>
+        <w:rPr>
           <w:color w:val="000000"/>
           <w:sz w:val="24"/>
           <w:szCs w:val="24"/>
@@ -285,55 +233,17 @@
           <w:numId w:val="1"/>
         </w:numPr>
         <w:bidi w:val="false"/>
-        <w:spacing w:after="60" w:before="60"/>
-      </w:pPr>
-      <w:r>
-        <w:rPr>
-          <w:rFonts w:ascii="Aptos" w:cs="Aptos" w:eastAsia="Aptos" w:hAnsi="Aptos"/>
-          <w:color w:val="000000"/>
-          <w:sz w:val="24"/>
-          <w:szCs w:val="24"/>
-          <w:rtl w:val="false"/>
-        </w:rPr>
-        <w:t xml:space="preserve">Integrated auto-triage into the support workflow, automating or deflecting up to 30% of inbound tickets.</w:t>
-      </w:r>
-    </w:p>
-    <w:p>
-      <w:pPr>
-        <w:bidi w:val="false"/>
-        <w:spacing w:after="120" w:before="120" w:line="259.20000000000005"/>
-        <w:jc w:val="left"/>
-      </w:pPr>
-      <w:r>
-        <w:rPr>
-          <w:rFonts w:ascii="Aptos" w:cs="Aptos" w:eastAsia="Aptos" w:hAnsi="Aptos"/>
-          <w:color w:val="000000"/>
-          <w:sz w:val="24"/>
-          <w:szCs w:val="24"/>
-          <w:rtl w:val="false"/>
-        </w:rPr>
-        <w:t xml:space="preserve">Technologies: Go, Zendesk, Intercom, REST APIs, monitoring.</w:t>
-      </w:r>
-    </w:p>
-    <w:p>
-      <w:pPr>
-        <w:pStyle w:val="3"/>
-        <w:pStyle w:val="Heading3"/>
-        <w:bidi w:val="false"/>
-        <w:spacing w:after="120" w:before="240"/>
-      </w:pPr>
-      <w:bookmarkStart w:name="_Toc_airSlate_Software_Developer_February_202_7" w:id="1"/>
-      <w:r>
-        <w:rPr>
-          <w:rFonts w:ascii="Aptos" w:cs="Aptos" w:eastAsia="Aptos" w:hAnsi="Aptos"/>
-          <w:color w:val="000000"/>
-          <w:sz w:val="24"/>
-          <w:szCs w:val="24"/>
-          <w:rtl w:val="false"/>
-        </w:rPr>
-        <w:t xml:space="preserve">airSlate — Software Developer | February 2021–August 2023</w:t>
-      </w:r>
-      <w:bookmarkEnd w:id="1"/>
+        <w:spacing w:after="120" w:before="120"/>
+      </w:pPr>
+      <w:r>
+        <w:rPr>
+          <w:color w:val="000000"/>
+          <w:sz w:val="24"/>
+          <w:szCs w:val="24"/>
+          <w:rtl w:val="false"/>
+        </w:rPr>
+        <w:t xml:space="preserve">Designed and owned a Go-based support-automation platform connecting customer-support tools and internal services.</w:t>
+      </w:r>
     </w:p>
     <w:p>
       <w:pPr>
@@ -343,55 +253,17 @@
           <w:numId w:val="1"/>
         </w:numPr>
         <w:bidi w:val="false"/>
-        <w:spacing w:after="60" w:before="60"/>
-      </w:pPr>
-      <w:r>
-        <w:rPr>
-          <w:rFonts w:ascii="Aptos" w:cs="Aptos" w:eastAsia="Aptos" w:hAnsi="Aptos"/>
-          <w:color w:val="000000"/>
-          <w:sz w:val="24"/>
-          <w:szCs w:val="24"/>
-          <w:rtl w:val="false"/>
-        </w:rPr>
-        <w:t xml:space="preserve">Reduced peak load on the main database by removing bottlenecks and redistributing workload, improving service stability during high-traffic periods.</w:t>
-      </w:r>
-    </w:p>
-    <w:p>
-      <w:pPr>
-        <w:bidi w:val="false"/>
-        <w:spacing w:after="120" w:before="120" w:line="259.20000000000005"/>
-        <w:jc w:val="left"/>
-      </w:pPr>
-      <w:r>
-        <w:rPr>
-          <w:rFonts w:ascii="Aptos" w:cs="Aptos" w:eastAsia="Aptos" w:hAnsi="Aptos"/>
-          <w:color w:val="000000"/>
-          <w:sz w:val="24"/>
-          <w:szCs w:val="24"/>
-          <w:rtl w:val="false"/>
-        </w:rPr>
-        <w:t xml:space="preserve">Technologies: PHP, Laravel, MySQL, Elasticsearch, RabbitMQ, AWS, REST APIs, CI/CD.</w:t>
-      </w:r>
-    </w:p>
-    <w:p>
-      <w:pPr>
-        <w:pStyle w:val="3"/>
-        <w:pStyle w:val="Heading3"/>
-        <w:bidi w:val="false"/>
-        <w:spacing w:after="120" w:before="240"/>
-      </w:pPr>
-      <w:bookmarkStart w:name="_Toc_Hyprr_Technical_Lead_November_2019Januar_8" w:id="1"/>
-      <w:r>
-        <w:rPr>
-          <w:rFonts w:ascii="Aptos" w:cs="Aptos" w:eastAsia="Aptos" w:hAnsi="Aptos"/>
-          <w:color w:val="000000"/>
-          <w:sz w:val="24"/>
-          <w:szCs w:val="24"/>
-          <w:rtl w:val="false"/>
-        </w:rPr>
-        <w:t xml:space="preserve">Hyprr — Technical Lead | November 2019–January 2021</w:t>
-      </w:r>
-      <w:bookmarkEnd w:id="1"/>
+        <w:spacing w:after="120" w:before="120"/>
+      </w:pPr>
+      <w:r>
+        <w:rPr>
+          <w:color w:val="000000"/>
+          <w:sz w:val="24"/>
+          <w:szCs w:val="24"/>
+          <w:rtl w:val="false"/>
+        </w:rPr>
+        <w:t xml:space="preserve">Integrated auto-triage flows that automated or deflected up to 30% of inbound tickets.</w:t>
+      </w:r>
     </w:p>
     <w:p>
       <w:pPr>
@@ -401,18 +273,52 @@
           <w:numId w:val="1"/>
         </w:numPr>
         <w:bidi w:val="false"/>
-        <w:spacing w:after="60" w:before="60"/>
-      </w:pPr>
-      <w:r>
-        <w:rPr>
-          <w:rFonts w:ascii="Aptos" w:cs="Aptos" w:eastAsia="Aptos" w:hAnsi="Aptos"/>
-          <w:color w:val="000000"/>
-          <w:sz w:val="24"/>
-          <w:szCs w:val="24"/>
-          <w:rtl w:val="false"/>
-        </w:rPr>
-        <w:t xml:space="preserve">Helped bring a product from prototype to closed beta in under six months.</w:t>
-      </w:r>
+        <w:spacing w:after="120" w:before="120"/>
+      </w:pPr>
+      <w:r>
+        <w:rPr>
+          <w:color w:val="000000"/>
+          <w:sz w:val="24"/>
+          <w:szCs w:val="24"/>
+          <w:rtl w:val="false"/>
+        </w:rPr>
+        <w:t xml:space="preserve">Contributed to an LLM-assisted support agent for email and multilingual workflows, expanding automation coverage and enabling new support scenarios with less engineering involvement.</w:t>
+      </w:r>
+    </w:p>
+    <w:p>
+      <w:pPr>
+        <w:bidi w:val="false"/>
+        <w:spacing w:after="240" w:before="240" w:line="276"/>
+        <w:jc w:val="left"/>
+      </w:pPr>
+      <w:r>
+        <w:rPr>
+          <w:color w:val="000000"/>
+          <w:sz w:val="24"/>
+          <w:szCs w:val="24"/>
+          <w:rtl w:val="false"/>
+        </w:rPr>
+        <w:t xml:space="preserve">Technologies: Go, backend integrations, REST APIs, monitoring.</w:t>
+      </w:r>
+    </w:p>
+    <w:p>
+      <w:pPr>
+        <w:pStyle w:val="3"/>
+        <w:pStyle w:val="Heading3"/>
+        <w:bidi w:val="false"/>
+        <w:spacing w:after="120" w:before="240"/>
+      </w:pPr>
+      <w:bookmarkStart w:name="_Toc_airSlate_Software_Developer_Technical_Le_6" w:id="1"/>
+      <w:r>
+        <w:rPr>
+          <w:color w:val="000000"/>
+          <w:sz w:val="24"/>
+          <w:szCs w:val="24"/>
+          <w:rtl w:val="false"/>
+        </w:rPr>
+        <w:t xml:space="preserve">airSlate — Software Developer / Technical Lead | February 2021–August 2023</w:t>
+      </w:r>
+      <w:bookmarkEnd w:id="1"/>
     </w:p>
     <w:p>
       <w:pPr>
@@ -422,17 +328,16 @@
           <w:numId w:val="1"/>
         </w:numPr>
         <w:bidi w:val="false"/>
-        <w:spacing w:after="60" w:before="60"/>
-      </w:pPr>
-      <w:r>
-        <w:rPr>
-          <w:rFonts w:ascii="Aptos" w:cs="Aptos" w:eastAsia="Aptos" w:hAnsi="Aptos"/>
-          <w:color w:val="000000"/>
-          <w:sz w:val="24"/>
-          <w:szCs w:val="24"/>
-          <w:rtl w:val="false"/>
-        </w:rPr>
-        <w:t xml:space="preserve">Defined the technology roadmap with the CTO.</w:t>
+        <w:spacing w:after="120" w:before="120"/>
+      </w:pPr>
+      <w:r>
+        <w:rPr>
+          <w:color w:val="000000"/>
+          <w:sz w:val="24"/>
+          <w:szCs w:val="24"/>
+          <w:rtl w:val="false"/>
+        </w:rPr>
+        <w:t xml:space="preserve">Reduced peak load on the main database by redistributing workload, improving service stability during high-traffic periods.</w:t>
       </w:r>
     </w:p>
     <w:p>
@@ -443,17 +348,16 @@
           <w:numId w:val="1"/>
         </w:numPr>
         <w:bidi w:val="false"/>
-        <w:spacing w:after="60" w:before="60"/>
-      </w:pPr>
-      <w:r>
-        <w:rPr>
-          <w:rFonts w:ascii="Aptos" w:cs="Aptos" w:eastAsia="Aptos" w:hAnsi="Aptos"/>
-          <w:color w:val="000000"/>
-          <w:sz w:val="24"/>
-          <w:szCs w:val="24"/>
-          <w:rtl w:val="false"/>
-        </w:rPr>
-        <w:t xml:space="preserve">Helped establish the core technology stack for product delivery.</w:t>
+        <w:spacing w:after="120" w:before="120"/>
+      </w:pPr>
+      <w:r>
+        <w:rPr>
+          <w:color w:val="000000"/>
+          <w:sz w:val="24"/>
+          <w:szCs w:val="24"/>
+          <w:rtl w:val="false"/>
+        </w:rPr>
+        <w:t xml:space="preserve">Developed a Laravel/Symfony product-wide logger package aligned with an interservice-communication standard.</w:t>
       </w:r>
     </w:p>
     <w:p>
@@ -464,18 +368,52 @@
           <w:numId w:val="1"/>
         </w:numPr>
         <w:bidi w:val="false"/>
-        <w:spacing w:after="60" w:before="60"/>
-      </w:pPr>
-      <w:r>
-        <w:rPr>
-          <w:rFonts w:ascii="Aptos" w:cs="Aptos" w:eastAsia="Aptos" w:hAnsi="Aptos"/>
-          <w:color w:val="000000"/>
-          <w:sz w:val="24"/>
-          <w:szCs w:val="24"/>
-          <w:rtl w:val="false"/>
-        </w:rPr>
-        <w:t xml:space="preserve">Led backend development for platform work involving Ethereum-based digital assets.</w:t>
-      </w:r>
+        <w:spacing w:after="120" w:before="120"/>
+      </w:pPr>
+      <w:r>
+        <w:rPr>
+          <w:color w:val="000000"/>
+          <w:sz w:val="24"/>
+          <w:szCs w:val="24"/>
+          <w:rtl w:val="false"/>
+        </w:rPr>
+        <w:t xml:space="preserve">Delivered team assignments from initial draft through production release, coordinating scope, planning, and delivery across the project lifecycle.</w:t>
+      </w:r>
+    </w:p>
+    <w:p>
+      <w:pPr>
+        <w:bidi w:val="false"/>
+        <w:spacing w:after="240" w:before="240" w:line="276"/>
+        <w:jc w:val="left"/>
+      </w:pPr>
+      <w:r>
+        <w:rPr>
+          <w:color w:val="000000"/>
+          <w:sz w:val="24"/>
+          <w:szCs w:val="24"/>
+          <w:rtl w:val="false"/>
+        </w:rPr>
+        <w:t xml:space="preserve">Technologies: PHP, Laravel, Symfony, MySQL, Elasticsearch, RabbitMQ, AWS, REST APIs, CI/CD.</w:t>
+      </w:r>
+    </w:p>
+    <w:p>
+      <w:pPr>
+        <w:pStyle w:val="3"/>
+        <w:pStyle w:val="Heading3"/>
+        <w:bidi w:val="false"/>
+        <w:spacing w:after="120" w:before="240"/>
+      </w:pPr>
+      <w:bookmarkStart w:name="_Toc_Hyprr_Technical_Lead_November_2019Januar_7" w:id="1"/>
+      <w:r>
+        <w:rPr>
+          <w:color w:val="000000"/>
+          <w:sz w:val="24"/>
+          <w:szCs w:val="24"/>
+          <w:rtl w:val="false"/>
+        </w:rPr>
+        <w:t xml:space="preserve">Hyprr — Technical Lead | November 2019–January 2021</w:t>
+      </w:r>
+      <w:bookmarkEnd w:id="1"/>
     </w:p>
     <w:p>
       <w:pPr>
@@ -485,17 +423,16 @@
           <w:numId w:val="1"/>
         </w:numPr>
         <w:bidi w:val="false"/>
-        <w:spacing w:after="60" w:before="60"/>
-      </w:pPr>
-      <w:r>
-        <w:rPr>
-          <w:rFonts w:ascii="Aptos" w:cs="Aptos" w:eastAsia="Aptos" w:hAnsi="Aptos"/>
-          <w:color w:val="000000"/>
-          <w:sz w:val="24"/>
-          <w:szCs w:val="24"/>
-          <w:rtl w:val="false"/>
-        </w:rPr>
-        <w:t xml:space="preserve">Worked on the platform's Ethereum-based digital asset components.</w:t>
+        <w:spacing w:after="120" w:before="120"/>
+      </w:pPr>
+      <w:r>
+        <w:rPr>
+          <w:color w:val="000000"/>
+          <w:sz w:val="24"/>
+          <w:szCs w:val="24"/>
+          <w:rtl w:val="false"/>
+        </w:rPr>
+        <w:t xml:space="preserve">Helped bring a creator-focused digital product from prototype to closed beta in under six months.</w:t>
       </w:r>
     </w:p>
     <w:p>
@@ -506,55 +443,17 @@
           <w:numId w:val="1"/>
         </w:numPr>
         <w:bidi w:val="false"/>
-        <w:spacing w:after="60" w:before="60"/>
-      </w:pPr>
-      <w:r>
-        <w:rPr>
-          <w:rFonts w:ascii="Aptos" w:cs="Aptos" w:eastAsia="Aptos" w:hAnsi="Aptos"/>
-          <w:color w:val="000000"/>
-          <w:sz w:val="24"/>
-          <w:szCs w:val="24"/>
-          <w:rtl w:val="false"/>
-        </w:rPr>
-        <w:t xml:space="preserve">Contributed to planning, microservice and serverless architecture, CI/CD, and reliability and serviceability decisions.</w:t>
-      </w:r>
-    </w:p>
-    <w:p>
-      <w:pPr>
-        <w:bidi w:val="false"/>
-        <w:spacing w:after="120" w:before="120" w:line="259.20000000000005"/>
-        <w:jc w:val="left"/>
-      </w:pPr>
-      <w:r>
-        <w:rPr>
-          <w:rFonts w:ascii="Aptos" w:cs="Aptos" w:eastAsia="Aptos" w:hAnsi="Aptos"/>
-          <w:color w:val="000000"/>
-          <w:sz w:val="24"/>
-          <w:szCs w:val="24"/>
-          <w:rtl w:val="false"/>
-        </w:rPr>
-        <w:t xml:space="preserve">Technologies: PHP, Go, Laravel, MySQL, AWS, microservices, REST APIs, CI/CD.</w:t>
-      </w:r>
-    </w:p>
-    <w:p>
-      <w:pPr>
-        <w:pStyle w:val="3"/>
-        <w:pStyle w:val="Heading3"/>
-        <w:bidi w:val="false"/>
-        <w:spacing w:after="120" w:before="240"/>
-      </w:pPr>
-      <w:bookmarkStart w:name="_Toc_PDFfiller_Software_Developer_October_201_9" w:id="1"/>
-      <w:r>
-        <w:rPr>
-          <w:rFonts w:ascii="Aptos" w:cs="Aptos" w:eastAsia="Aptos" w:hAnsi="Aptos"/>
-          <w:color w:val="000000"/>
-          <w:sz w:val="24"/>
-          <w:szCs w:val="24"/>
-          <w:rtl w:val="false"/>
-        </w:rPr>
-        <w:t xml:space="preserve">PDFfiller — Software Developer | October 2016–November 2019</w:t>
-      </w:r>
-      <w:bookmarkEnd w:id="1"/>
+        <w:spacing w:after="120" w:before="120"/>
+      </w:pPr>
+      <w:r>
+        <w:rPr>
+          <w:color w:val="000000"/>
+          <w:sz w:val="24"/>
+          <w:szCs w:val="24"/>
+          <w:rtl w:val="false"/>
+        </w:rPr>
+        <w:t xml:space="preserve">Defined the technology roadmap with the CTO and led backend development across microservice and serverless architecture decisions.</w:t>
+      </w:r>
     </w:p>
     <w:p>
       <w:pPr>
@@ -564,18 +463,52 @@
           <w:numId w:val="1"/>
         </w:numPr>
         <w:bidi w:val="false"/>
-        <w:spacing w:after="60" w:before="60"/>
-      </w:pPr>
-      <w:r>
-        <w:rPr>
-          <w:rFonts w:ascii="Aptos" w:cs="Aptos" w:eastAsia="Aptos" w:hAnsi="Aptos"/>
-          <w:color w:val="000000"/>
-          <w:sz w:val="24"/>
-          <w:szCs w:val="24"/>
-          <w:rtl w:val="false"/>
-        </w:rPr>
-        <w:t xml:space="preserve">Led five backend engineers developing a transactional email service.</w:t>
-      </w:r>
+        <w:spacing w:after="120" w:before="120"/>
+      </w:pPr>
+      <w:r>
+        <w:rPr>
+          <w:color w:val="000000"/>
+          <w:sz w:val="24"/>
+          <w:szCs w:val="24"/>
+          <w:rtl w:val="false"/>
+        </w:rPr>
+        <w:t xml:space="preserve">Influenced project planning, CI/CD, reliability, and serviceability decisions as the product moved toward closed beta.</w:t>
+      </w:r>
+    </w:p>
+    <w:p>
+      <w:pPr>
+        <w:bidi w:val="false"/>
+        <w:spacing w:after="240" w:before="240" w:line="276"/>
+        <w:jc w:val="left"/>
+      </w:pPr>
+      <w:r>
+        <w:rPr>
+          <w:color w:val="000000"/>
+          <w:sz w:val="24"/>
+          <w:szCs w:val="24"/>
+          <w:rtl w:val="false"/>
+        </w:rPr>
+        <w:t xml:space="preserve">Technologies: PHP, Go, Laravel, MySQL, AWS, microservices, REST APIs, CI/CD.</w:t>
+      </w:r>
+    </w:p>
+    <w:p>
+      <w:pPr>
+        <w:pStyle w:val="3"/>
+        <w:pStyle w:val="Heading3"/>
+        <w:bidi w:val="false"/>
+        <w:spacing w:after="120" w:before="240"/>
+      </w:pPr>
+      <w:bookmarkStart w:name="_Toc_PDFfiller_Software_Developer_October_201_8" w:id="1"/>
+      <w:r>
+        <w:rPr>
+          <w:color w:val="000000"/>
+          <w:sz w:val="24"/>
+          <w:szCs w:val="24"/>
+          <w:rtl w:val="false"/>
+        </w:rPr>
+        <w:t xml:space="preserve">PDFfiller — Software Developer | October 2016–November 2019</w:t>
+      </w:r>
+      <w:bookmarkEnd w:id="1"/>
     </w:p>
     <w:p>
       <w:pPr>
@@ -585,28 +518,66 @@
           <w:numId w:val="1"/>
         </w:numPr>
         <w:bidi w:val="false"/>
-        <w:spacing w:after="60" w:before="60"/>
-      </w:pPr>
-      <w:r>
-        <w:rPr>
-          <w:rFonts w:ascii="Aptos" w:cs="Aptos" w:eastAsia="Aptos" w:hAnsi="Aptos"/>
-          <w:color w:val="000000"/>
-          <w:sz w:val="24"/>
-          <w:szCs w:val="24"/>
-          <w:rtl w:val="false"/>
-        </w:rPr>
-        <w:t xml:space="preserve">Scaled the service to around 50 million emails per month.</w:t>
-      </w:r>
-    </w:p>
-    <w:p>
-      <w:pPr>
-        <w:bidi w:val="false"/>
-        <w:spacing w:after="120" w:before="120" w:line="259.20000000000005"/>
+        <w:spacing w:after="120" w:before="120"/>
+      </w:pPr>
+      <w:r>
+        <w:rPr>
+          <w:color w:val="000000"/>
+          <w:sz w:val="24"/>
+          <w:szCs w:val="24"/>
+          <w:rtl w:val="false"/>
+        </w:rPr>
+        <w:t xml:space="preserve">Led a team of five backend engineers developing a transactional-email service.</w:t>
+      </w:r>
+    </w:p>
+    <w:p>
+      <w:pPr>
+        <w:pStyle w:val="ListParagraph"/>
+        <w:numPr>
+          <w:ilvl w:val="0"/>
+          <w:numId w:val="1"/>
+        </w:numPr>
+        <w:bidi w:val="false"/>
+        <w:spacing w:after="120" w:before="120"/>
+      </w:pPr>
+      <w:r>
+        <w:rPr>
+          <w:color w:val="000000"/>
+          <w:sz w:val="24"/>
+          <w:szCs w:val="24"/>
+          <w:rtl w:val="false"/>
+        </w:rPr>
+        <w:t xml:space="preserve">Scaled the service to around 50 million emails per month and built deep expertise in DNS, DKIM, SPF, DMARC, and feedback loops.</w:t>
+      </w:r>
+    </w:p>
+    <w:p>
+      <w:pPr>
+        <w:pStyle w:val="ListParagraph"/>
+        <w:numPr>
+          <w:ilvl w:val="0"/>
+          <w:numId w:val="1"/>
+        </w:numPr>
+        <w:bidi w:val="false"/>
+        <w:spacing w:after="120" w:before="120"/>
+      </w:pPr>
+      <w:r>
+        <w:rPr>
+          <w:color w:val="000000"/>
+          <w:sz w:val="24"/>
+          <w:szCs w:val="24"/>
+          <w:rtl w:val="false"/>
+        </w:rPr>
+        <w:t xml:space="preserve">Led the team through Black Friday/Cyber Monday peak periods, when customer traffic grew more than tenfold.</w:t>
+      </w:r>
+    </w:p>
+    <w:p>
+      <w:pPr>
+        <w:bidi w:val="false"/>
+        <w:spacing w:after="240" w:before="240" w:line="276"/>
         <w:jc w:val="left"/>
       </w:pPr>
       <w:r>
         <w:rPr>
-          <w:rFonts w:ascii="Aptos" w:cs="Aptos" w:eastAsia="Aptos" w:hAnsi="Aptos"/>
           <w:color w:val="000000"/>
           <w:sz w:val="24"/>
           <w:szCs w:val="24"/>
@@ -622,10 +593,9 @@
         <w:bidi w:val="false"/>
         <w:spacing w:after="120" w:before="240"/>
       </w:pPr>
-      <w:bookmarkStart w:name="_Toc_Education_10" w:id="1"/>
-      <w:r>
-        <w:rPr>
-          <w:rFonts w:ascii="Aptos" w:cs="Aptos" w:eastAsia="Aptos" w:hAnsi="Aptos"/>
+      <w:bookmarkStart w:name="_Toc_Education_9" w:id="1"/>
+      <w:r>
+        <w:rPr>
           <w:color w:val="000000"/>
           <w:sz w:val="28"/>
           <w:szCs w:val="28"/>
@@ -638,12 +608,11 @@
     <w:p>
       <w:pPr>
         <w:bidi w:val="false"/>
-        <w:spacing w:after="120" w:before="120" w:line="259.20000000000005"/>
+        <w:spacing w:after="240" w:before="240" w:line="276"/>
         <w:jc w:val="left"/>
       </w:pPr>
       <w:r>
         <w:rPr>
-          <w:rFonts w:ascii="Aptos" w:cs="Aptos" w:eastAsia="Aptos" w:hAnsi="Aptos"/>
           <w:color w:val="000000"/>
           <w:sz w:val="24"/>
           <w:szCs w:val="24"/>
@@ -659,10 +628,9 @@
         <w:bidi w:val="false"/>
         <w:spacing w:after="120" w:before="240"/>
       </w:pPr>
-      <w:bookmarkStart w:name="_Toc_Languages_11" w:id="1"/>
-      <w:r>
-        <w:rPr>
-          <w:rFonts w:ascii="Aptos" w:cs="Aptos" w:eastAsia="Aptos" w:hAnsi="Aptos"/>
+      <w:bookmarkStart w:name="_Toc_Languages_10" w:id="1"/>
+      <w:r>
+        <w:rPr>
           <w:color w:val="000000"/>
           <w:sz w:val="28"/>
           <w:szCs w:val="28"/>
@@ -675,12 +643,11 @@
     <w:p>
       <w:pPr>
         <w:bidi w:val="false"/>
-        <w:spacing w:after="120" w:before="120" w:line="259.20000000000005"/>
+        <w:spacing w:after="240" w:before="240" w:line="276"/>
         <w:jc w:val="left"/>
       </w:pPr>
       <w:r>
         <w:rPr>
-          <w:rFonts w:ascii="Aptos" w:cs="Aptos" w:eastAsia="Aptos" w:hAnsi="Aptos"/>
           <w:color w:val="000000"/>
           <w:sz w:val="24"/>
           <w:szCs w:val="24"/>
@@ -750,7 +717,6 @@
     </w:pPr>
     <w:r>
       <w:rPr>
-        <w:rFonts w:ascii="Aptos" w:cs="Aptos" w:eastAsia="Aptos" w:hAnsi="Aptos"/>
         <w:sz w:val="24"/>
         <w:szCs w:val="24"/>
         <w:rtl w:val="false"/>
@@ -1079,11 +1045,10 @@
     <w:next w:val="Normal"/>
     <w:qFormat/>
     <w:pPr>
-      <w:spacing w:after="240" w:line="259.20000000000005"/>
+      <w:spacing w:after="240" w:line="276"/>
       <w:jc w:val="center"/>
     </w:pPr>
     <w:rPr>
-      <w:rFonts w:ascii="Aptos" w:cs="Aptos" w:eastAsia="Aptos" w:hAnsi="Aptos"/>
       <w:b/>
       <w:bCs/>
       <w:color w:val="000000"/>
@@ -1101,7 +1066,6 @@
       <w:outlineLvl w:val="1"/>
     </w:pPr>
     <w:rPr>
-      <w:rFonts w:ascii="Aptos" w:cs="Aptos" w:eastAsia="Aptos" w:hAnsi="Aptos"/>
       <w:b/>
       <w:bCs/>
       <w:color w:val="000000"/>
@@ -1119,7 +1083,6 @@
       <w:outlineLvl w:val="2"/>
     </w:pPr>
     <w:rPr>
-      <w:rFonts w:ascii="Aptos" w:cs="Aptos" w:eastAsia="Aptos" w:hAnsi="Aptos"/>
       <w:b/>
       <w:bCs/>
       <w:color w:val="000000"/>
@@ -1137,7 +1100,6 @@
       <w:outlineLvl w:val="3"/>
     </w:pPr>
     <w:rPr>
-      <w:rFonts w:ascii="Aptos" w:cs="Aptos" w:eastAsia="Aptos" w:hAnsi="Aptos"/>
       <w:b/>
       <w:bCs/>
       <w:color w:val="000000"/>
@@ -1155,7 +1117,6 @@
       <w:outlineLvl w:val="4"/>
     </w:pPr>
     <w:rPr>
-      <w:rFonts w:ascii="Aptos" w:cs="Aptos" w:eastAsia="Aptos" w:hAnsi="Aptos"/>
       <w:b/>
       <w:bCs/>
       <w:color w:val="000000"/>
@@ -1173,7 +1134,6 @@
       <w:outlineLvl w:val="5"/>
     </w:pPr>
     <w:rPr>
-      <w:rFonts w:ascii="Aptos" w:cs="Aptos" w:eastAsia="Aptos" w:hAnsi="Aptos"/>
       <w:b/>
       <w:bCs/>
       <w:color w:val="000000"/>
@@ -1191,7 +1151,6 @@
       <w:outlineLvl w:val="6"/>
     </w:pPr>
     <w:rPr>
-      <w:rFonts w:ascii="Aptos" w:cs="Aptos" w:eastAsia="Aptos" w:hAnsi="Aptos"/>
       <w:b/>
       <w:bCs/>
       <w:color w:val="000000"/>
@@ -1202,7 +1161,6 @@
   <w:style w:type="paragraph" w:styleId="Strong">
     <w:name w:val="Strong"/>
     <w:rPr>
-      <w:rFonts w:ascii="Aptos" w:cs="Aptos" w:eastAsia="Aptos" w:hAnsi="Aptos"/>
       <w:b/>
       <w:bCs/>
     </w:rPr>

</xml_diff>

<commit_message>
Expand recent roles in ZFORT and IT Delight CVs
</commit_message>
<xml_diff>
--- a/registry/jobs/2026-09-23_135953_it-delight_senior-go-developer/application/CV_ValentinNikolaev_itdelight_SeniorGoDeveloper.docx
+++ b/registry/jobs/2026-09-23_135953_it-delight_senior-go-developer/application/CV_ValentinNikolaev_itdelight_SeniorGoDeveloper.docx
@@ -52,7 +52,7 @@
         </w:rPr>
         <w:t xml:space="preserve">Rome, Italy | +39 351 370 1194 | </w:t>
       </w:r>
-      <w:hyperlink w:history="1" r:id="rIdtgf8b_bxkeetxu_cdreec">
+      <w:hyperlink w:history="1" r:id="rIdhy-xaocycgu7r_wxiueru">
         <w:r>
           <w:rPr>
             <w:color w:val="0000FF"/>
@@ -83,7 +83,7 @@
         </w:rPr>
         <w:t xml:space="preserve">LinkedIn: </w:t>
       </w:r>
-      <w:hyperlink w:history="1" r:id="rIdcx4gw2_6z_tz1s9peszzj">
+      <w:hyperlink w:history="1" r:id="rIdc6t9wk2ogkt0oxlv5g9sn">
         <w:r>
           <w:rPr>
             <w:color w:val="0000FF"/>
@@ -104,7 +104,7 @@
         </w:rPr>
         <w:t xml:space="preserve"> | GitHub: </w:t>
       </w:r>
-      <w:hyperlink w:history="1" r:id="rId7zdhp0edytg6sknobeqva">
+      <w:hyperlink w:history="1" r:id="rIdksul-u2fd40_-vn9hh1pr">
         <w:r>
           <w:rPr>
             <w:color w:val="0000FF"/>
@@ -262,6 +262,26 @@
           <w:szCs w:val="24"/>
           <w:rtl w:val="false"/>
         </w:rPr>
+        <w:t xml:space="preserve">Engineered an API orchestration layer for ticket routing, classification, and lifecycle tracking across the support workflow.</w:t>
+      </w:r>
+    </w:p>
+    <w:p>
+      <w:pPr>
+        <w:pStyle w:val="ListParagraph"/>
+        <w:numPr>
+          <w:ilvl w:val="0"/>
+          <w:numId w:val="1"/>
+        </w:numPr>
+        <w:bidi w:val="false"/>
+        <w:spacing w:after="120" w:before="120"/>
+      </w:pPr>
+      <w:r>
+        <w:rPr>
+          <w:color w:val="000000"/>
+          <w:sz w:val="24"/>
+          <w:szCs w:val="24"/>
+          <w:rtl w:val="false"/>
+        </w:rPr>
         <w:t xml:space="preserve">Integrated auto-triage flows that automated or deflected up to 30% of inbound tickets.</w:t>
       </w:r>
     </w:p>
@@ -283,6 +303,26 @@
           <w:rtl w:val="false"/>
         </w:rPr>
         <w:t xml:space="preserve">Contributed to an LLM-assisted support agent for email and multilingual workflows, expanding automation coverage and enabling new support scenarios with less engineering involvement.</w:t>
+      </w:r>
+    </w:p>
+    <w:p>
+      <w:pPr>
+        <w:pStyle w:val="ListParagraph"/>
+        <w:numPr>
+          <w:ilvl w:val="0"/>
+          <w:numId w:val="1"/>
+        </w:numPr>
+        <w:bidi w:val="false"/>
+        <w:spacing w:after="120" w:before="120"/>
+      </w:pPr>
+      <w:r>
+        <w:rPr>
+          <w:color w:val="000000"/>
+          <w:sz w:val="24"/>
+          <w:szCs w:val="24"/>
+          <w:rtl w:val="false"/>
+        </w:rPr>
+        <w:t xml:space="preserve">Worked with Support Operations, Product, and AI teams to align automation changes with measurable support outcomes.</w:t>
       </w:r>
     </w:p>
     <w:p>
@@ -378,6 +418,46 @@
           <w:rtl w:val="false"/>
         </w:rPr>
         <w:t xml:space="preserve">Delivered team assignments from initial draft through production release, coordinating scope, planning, and delivery across the project lifecycle.</w:t>
+      </w:r>
+    </w:p>
+    <w:p>
+      <w:pPr>
+        <w:pStyle w:val="ListParagraph"/>
+        <w:numPr>
+          <w:ilvl w:val="0"/>
+          <w:numId w:val="1"/>
+        </w:numPr>
+        <w:bidi w:val="false"/>
+        <w:spacing w:after="120" w:before="120"/>
+      </w:pPr>
+      <w:r>
+        <w:rPr>
+          <w:color w:val="000000"/>
+          <w:sz w:val="24"/>
+          <w:szCs w:val="24"/>
+          <w:rtl w:val="false"/>
+        </w:rPr>
+        <w:t xml:space="preserve">Contributed to Agile planning, release roadmaps, and task distribution across planning intervals.</w:t>
+      </w:r>
+    </w:p>
+    <w:p>
+      <w:pPr>
+        <w:pStyle w:val="ListParagraph"/>
+        <w:numPr>
+          <w:ilvl w:val="0"/>
+          <w:numId w:val="1"/>
+        </w:numPr>
+        <w:bidi w:val="false"/>
+        <w:spacing w:after="120" w:before="120"/>
+      </w:pPr>
+      <w:r>
+        <w:rPr>
+          <w:color w:val="000000"/>
+          <w:sz w:val="24"/>
+          <w:szCs w:val="24"/>
+          <w:rtl w:val="false"/>
+        </w:rPr>
+        <w:t xml:space="preserve">Investigated production issues through logs, monitoring, and SRE dashboards, then delivered fixes and operational improvements.</w:t>
       </w:r>
     </w:p>
     <w:p>

</xml_diff>

<commit_message>
Rebuild two senior Go CVs with confirmed platform impact
</commit_message>
<xml_diff>
--- a/registry/jobs/2026-09-23_135953_it-delight_senior-go-developer/application/CV_ValentinNikolaev_itdelight_SeniorGoDeveloper.docx
+++ b/registry/jobs/2026-09-23_135953_it-delight_senior-go-developer/application/CV_ValentinNikolaev_itdelight_SeniorGoDeveloper.docx
@@ -12,6 +12,7 @@
       <w:bookmarkStart w:name="_Toc_Valentin_Nikolaev_1" w:id="1"/>
       <w:r>
         <w:rPr>
+          <w:rFonts w:ascii="Aptos" w:cs="Aptos" w:eastAsia="Aptos" w:hAnsi="Aptos"/>
           <w:color w:val="000000"/>
           <w:sz w:val="32"/>
           <w:szCs w:val="32"/>
@@ -24,11 +25,12 @@
     <w:p>
       <w:pPr>
         <w:bidi w:val="false"/>
-        <w:spacing w:after="240" w:before="240" w:line="276"/>
-        <w:jc w:val="left"/>
-      </w:pPr>
-      <w:r>
-        <w:rPr>
+        <w:spacing w:after="120" w:before="120" w:line="259.20000000000005"/>
+        <w:jc w:val="left"/>
+      </w:pPr>
+      <w:r>
+        <w:rPr>
+          <w:rFonts w:ascii="Aptos" w:cs="Aptos" w:eastAsia="Aptos" w:hAnsi="Aptos"/>
           <w:color w:val="000000"/>
           <w:sz w:val="24"/>
           <w:szCs w:val="24"/>
@@ -40,21 +42,23 @@
     <w:p>
       <w:pPr>
         <w:bidi w:val="false"/>
-        <w:spacing w:after="240" w:before="240" w:line="276"/>
-        <w:jc w:val="left"/>
-      </w:pPr>
-      <w:r>
-        <w:rPr>
-          <w:color w:val="000000"/>
-          <w:sz w:val="24"/>
-          <w:szCs w:val="24"/>
-          <w:rtl w:val="false"/>
-        </w:rPr>
-        <w:t xml:space="preserve">Rome, Italy | +39 351 370 1194 | </w:t>
-      </w:r>
-      <w:hyperlink w:history="1" r:id="rIdhy-xaocycgu7r_wxiueru">
+        <w:spacing w:after="120" w:before="120" w:line="259.20000000000005"/>
+        <w:jc w:val="left"/>
+      </w:pPr>
+      <w:r>
+        <w:rPr>
+          <w:rFonts w:ascii="Aptos" w:cs="Aptos" w:eastAsia="Aptos" w:hAnsi="Aptos"/>
+          <w:color w:val="000000"/>
+          <w:sz w:val="24"/>
+          <w:szCs w:val="24"/>
+          <w:rtl w:val="false"/>
+        </w:rPr>
+        <w:t xml:space="preserve">Rome, Italy | </w:t>
+      </w:r>
+      <w:hyperlink w:history="1" r:id="rIdfzelxsfs0hfyjzzamjgsy">
         <w:r>
           <w:rPr>
+            <w:rFonts w:ascii="Aptos" w:cs="Aptos" w:eastAsia="Aptos" w:hAnsi="Aptos"/>
             <w:color w:val="0000FF"/>
             <w:sz w:val="24"/>
             <w:szCs w:val="24"/>
@@ -66,16 +70,24 @@
       </w:hyperlink>
       <w:r>
         <w:rPr>
-          <w:color w:val="000000"/>
-          <w:sz w:val="24"/>
-          <w:szCs w:val="24"/>
-          <w:rtl w:val="false"/>
-        </w:rPr>
-        <w:t xml:space="preserve">
-</w:t>
-      </w:r>
-      <w:r>
-        <w:rPr>
+          <w:rFonts w:ascii="Aptos" w:cs="Aptos" w:eastAsia="Aptos" w:hAnsi="Aptos"/>
+          <w:color w:val="000000"/>
+          <w:sz w:val="24"/>
+          <w:szCs w:val="24"/>
+          <w:rtl w:val="false"/>
+        </w:rPr>
+        <w:t xml:space="preserve"> | +39 351 370 1194</w:t>
+      </w:r>
+    </w:p>
+    <w:p>
+      <w:pPr>
+        <w:bidi w:val="false"/>
+        <w:spacing w:after="120" w:before="120" w:line="259.20000000000005"/>
+        <w:jc w:val="left"/>
+      </w:pPr>
+      <w:r>
+        <w:rPr>
+          <w:rFonts w:ascii="Aptos" w:cs="Aptos" w:eastAsia="Aptos" w:hAnsi="Aptos"/>
           <w:color w:val="000000"/>
           <w:sz w:val="24"/>
           <w:szCs w:val="24"/>
@@ -83,9 +95,10 @@
         </w:rPr>
         <w:t xml:space="preserve">LinkedIn: </w:t>
       </w:r>
-      <w:hyperlink w:history="1" r:id="rIdc6t9wk2ogkt0oxlv5g9sn">
+      <w:hyperlink w:history="1" r:id="rIdyq4_glhnirhc1q5yt8stv">
         <w:r>
           <w:rPr>
+            <w:rFonts w:ascii="Aptos" w:cs="Aptos" w:eastAsia="Aptos" w:hAnsi="Aptos"/>
             <w:color w:val="0000FF"/>
             <w:sz w:val="24"/>
             <w:szCs w:val="24"/>
@@ -95,18 +108,27 @@
           <w:t xml:space="preserve">https://linkedin.com/in/valentinnikolaev</w:t>
         </w:r>
       </w:hyperlink>
-      <w:r>
-        <w:rPr>
-          <w:color w:val="000000"/>
-          <w:sz w:val="24"/>
-          <w:szCs w:val="24"/>
-          <w:rtl w:val="false"/>
-        </w:rPr>
-        <w:t xml:space="preserve"> | GitHub: </w:t>
-      </w:r>
-      <w:hyperlink w:history="1" r:id="rIdksul-u2fd40_-vn9hh1pr">
+    </w:p>
+    <w:p>
+      <w:pPr>
+        <w:bidi w:val="false"/>
+        <w:spacing w:after="120" w:before="120" w:line="259.20000000000005"/>
+        <w:jc w:val="left"/>
+      </w:pPr>
+      <w:r>
+        <w:rPr>
+          <w:rFonts w:ascii="Aptos" w:cs="Aptos" w:eastAsia="Aptos" w:hAnsi="Aptos"/>
+          <w:color w:val="000000"/>
+          <w:sz w:val="24"/>
+          <w:szCs w:val="24"/>
+          <w:rtl w:val="false"/>
+        </w:rPr>
+        <w:t xml:space="preserve">GitHub: </w:t>
+      </w:r>
+      <w:hyperlink w:history="1" r:id="rIdfjmcmgk7yw2wd_o2yfmde">
         <w:r>
           <w:rPr>
+            <w:rFonts w:ascii="Aptos" w:cs="Aptos" w:eastAsia="Aptos" w:hAnsi="Aptos"/>
             <w:color w:val="0000FF"/>
             <w:sz w:val="24"/>
             <w:szCs w:val="24"/>
@@ -127,6 +149,7 @@
       <w:bookmarkStart w:name="_Toc_Summary_2" w:id="1"/>
       <w:r>
         <w:rPr>
+          <w:rFonts w:ascii="Aptos" w:cs="Aptos" w:eastAsia="Aptos" w:hAnsi="Aptos"/>
           <w:color w:val="000000"/>
           <w:sz w:val="28"/>
           <w:szCs w:val="28"/>
@@ -139,17 +162,18 @@
     <w:p>
       <w:pPr>
         <w:bidi w:val="false"/>
-        <w:spacing w:after="240" w:before="240" w:line="276"/>
-        <w:jc w:val="left"/>
-      </w:pPr>
-      <w:r>
-        <w:rPr>
-          <w:color w:val="000000"/>
-          <w:sz w:val="24"/>
-          <w:szCs w:val="24"/>
-          <w:rtl w:val="false"/>
-        </w:rPr>
-        <w:t xml:space="preserve">Backend engineer with 15+ years of experience delivering Go and PHP services, integrations, and high-load communication systems. Over the past five years I have worked on support automation, database stability, service observability, and backend delivery from planning through production. I combine hands-on development with technical leadership, focusing on clear service boundaries, reliable operations, and changes that solve a measured product or support problem. Earlier work adds experience leading an email-platform team through high-demand periods and taking a product from prototype to closed beta.</w:t>
+        <w:spacing w:after="120" w:before="120" w:line="259.20000000000005"/>
+        <w:jc w:val="left"/>
+      </w:pPr>
+      <w:r>
+        <w:rPr>
+          <w:rFonts w:ascii="Aptos" w:cs="Aptos" w:eastAsia="Aptos" w:hAnsi="Aptos"/>
+          <w:color w:val="000000"/>
+          <w:sz w:val="24"/>
+          <w:szCs w:val="24"/>
+          <w:rtl w:val="false"/>
+        </w:rPr>
+        <w:t xml:space="preserve">Senior backend engineer with 15+ years building Go and PHP production systems. Owned operation of a Go support platform at 20,000+ tickets per ordinary month and up to three times that volume in U.S. peak season. Architected event-driven analytics infrastructure with versioned schemas and reliable downstream routing, and earlier delivered a product from prototype to closed beta and led transactional-email engineering through BFCM peak demand.</w:t>
       </w:r>
     </w:p>
     <w:p>
@@ -162,6 +186,7 @@
       <w:bookmarkStart w:name="_Toc_Skills_3" w:id="1"/>
       <w:r>
         <w:rPr>
+          <w:rFonts w:ascii="Aptos" w:cs="Aptos" w:eastAsia="Aptos" w:hAnsi="Aptos"/>
           <w:color w:val="000000"/>
           <w:sz w:val="28"/>
           <w:szCs w:val="28"/>
@@ -174,17 +199,117 @@
     <w:p>
       <w:pPr>
         <w:bidi w:val="false"/>
-        <w:spacing w:after="240" w:before="240" w:line="276"/>
-        <w:jc w:val="left"/>
-      </w:pPr>
-      <w:r>
-        <w:rPr>
-          <w:color w:val="000000"/>
-          <w:sz w:val="24"/>
-          <w:szCs w:val="24"/>
-          <w:rtl w:val="false"/>
-        </w:rPr>
-        <w:t xml:space="preserve">Go; PHP; REST APIs; microservices; backend integrations; event-driven systems; MySQL; PostgreSQL; RabbitMQ; AWS; Laravel; Symfony; GitHub Actions; monitoring and logging; system design; performance optimization; CI/CD.</w:t>
+        <w:spacing w:after="120" w:before="120" w:line="259.20000000000005"/>
+        <w:jc w:val="left"/>
+      </w:pPr>
+      <w:r>
+        <w:rPr>
+          <w:rFonts w:ascii="Aptos" w:cs="Aptos" w:eastAsia="Aptos" w:hAnsi="Aptos"/>
+          <w:b/>
+          <w:bCs/>
+          <w:color w:val="000000"/>
+          <w:sz w:val="24"/>
+          <w:szCs w:val="24"/>
+          <w:rtl w:val="false"/>
+        </w:rPr>
+        <w:t xml:space="preserve">Backend &amp; architecture:</w:t>
+      </w:r>
+      <w:r>
+        <w:rPr>
+          <w:rFonts w:ascii="Aptos" w:cs="Aptos" w:eastAsia="Aptos" w:hAnsi="Aptos"/>
+          <w:color w:val="000000"/>
+          <w:sz w:val="24"/>
+          <w:szCs w:val="24"/>
+          <w:rtl w:val="false"/>
+        </w:rPr>
+        <w:t xml:space="preserve"> Go, PHP, REST APIs, microservices, system design</w:t>
+      </w:r>
+    </w:p>
+    <w:p>
+      <w:pPr>
+        <w:bidi w:val="false"/>
+        <w:spacing w:after="120" w:before="120" w:line="259.20000000000005"/>
+        <w:jc w:val="left"/>
+      </w:pPr>
+      <w:r>
+        <w:rPr>
+          <w:rFonts w:ascii="Aptos" w:cs="Aptos" w:eastAsia="Aptos" w:hAnsi="Aptos"/>
+          <w:b/>
+          <w:bCs/>
+          <w:color w:val="000000"/>
+          <w:sz w:val="24"/>
+          <w:szCs w:val="24"/>
+          <w:rtl w:val="false"/>
+        </w:rPr>
+        <w:t xml:space="preserve">Data &amp; events:</w:t>
+      </w:r>
+      <w:r>
+        <w:rPr>
+          <w:rFonts w:ascii="Aptos" w:cs="Aptos" w:eastAsia="Aptos" w:hAnsi="Aptos"/>
+          <w:color w:val="000000"/>
+          <w:sz w:val="24"/>
+          <w:szCs w:val="24"/>
+          <w:rtl w:val="false"/>
+        </w:rPr>
+        <w:t xml:space="preserve"> PostgreSQL, MySQL, Elasticsearch, queues, AWS EventBridge, event-driven systems</w:t>
+      </w:r>
+    </w:p>
+    <w:p>
+      <w:pPr>
+        <w:bidi w:val="false"/>
+        <w:spacing w:after="120" w:before="120" w:line="259.20000000000005"/>
+        <w:jc w:val="left"/>
+      </w:pPr>
+      <w:r>
+        <w:rPr>
+          <w:rFonts w:ascii="Aptos" w:cs="Aptos" w:eastAsia="Aptos" w:hAnsi="Aptos"/>
+          <w:b/>
+          <w:bCs/>
+          <w:color w:val="000000"/>
+          <w:sz w:val="24"/>
+          <w:szCs w:val="24"/>
+          <w:rtl w:val="false"/>
+        </w:rPr>
+        <w:t xml:space="preserve">Cloud &amp; delivery:</w:t>
+      </w:r>
+      <w:r>
+        <w:rPr>
+          <w:rFonts w:ascii="Aptos" w:cs="Aptos" w:eastAsia="Aptos" w:hAnsi="Aptos"/>
+          <w:color w:val="000000"/>
+          <w:sz w:val="24"/>
+          <w:szCs w:val="24"/>
+          <w:rtl w:val="false"/>
+        </w:rPr>
+        <w:t xml:space="preserve"> AWS, GitHub Actions</w:t>
+      </w:r>
+    </w:p>
+    <w:p>
+      <w:pPr>
+        <w:bidi w:val="false"/>
+        <w:spacing w:after="120" w:before="120" w:line="259.20000000000005"/>
+        <w:jc w:val="left"/>
+      </w:pPr>
+      <w:r>
+        <w:rPr>
+          <w:rFonts w:ascii="Aptos" w:cs="Aptos" w:eastAsia="Aptos" w:hAnsi="Aptos"/>
+          <w:b/>
+          <w:bCs/>
+          <w:color w:val="000000"/>
+          <w:sz w:val="24"/>
+          <w:szCs w:val="24"/>
+          <w:rtl w:val="false"/>
+        </w:rPr>
+        <w:t xml:space="preserve">Operations:</w:t>
+      </w:r>
+      <w:r>
+        <w:rPr>
+          <w:rFonts w:ascii="Aptos" w:cs="Aptos" w:eastAsia="Aptos" w:hAnsi="Aptos"/>
+          <w:color w:val="000000"/>
+          <w:sz w:val="24"/>
+          <w:szCs w:val="24"/>
+          <w:rtl w:val="false"/>
+        </w:rPr>
+        <w:t xml:space="preserve"> Prometheus, monitoring and logging, performance optimization, production reliability</w:t>
       </w:r>
     </w:p>
     <w:p>
@@ -197,6 +322,7 @@
       <w:bookmarkStart w:name="_Toc_Experience_4" w:id="1"/>
       <w:r>
         <w:rPr>
+          <w:rFonts w:ascii="Aptos" w:cs="Aptos" w:eastAsia="Aptos" w:hAnsi="Aptos"/>
           <w:color w:val="000000"/>
           <w:sz w:val="28"/>
           <w:szCs w:val="28"/>
@@ -213,17 +339,52 @@
         <w:bidi w:val="false"/>
         <w:spacing w:after="120" w:before="240"/>
       </w:pPr>
-      <w:bookmarkStart w:name="_Toc_Simplelife_Software_Developer_November_2_5" w:id="1"/>
-      <w:r>
-        <w:rPr>
-          <w:color w:val="000000"/>
-          <w:sz w:val="24"/>
-          <w:szCs w:val="24"/>
-          <w:rtl w:val="false"/>
-        </w:rPr>
-        <w:t xml:space="preserve">Simple.life — Software Developer | November 2023–July 2026</w:t>
+      <w:bookmarkStart w:name="_Toc_Simplelife_Simple_App_Software_Developer_5" w:id="1"/>
+      <w:r>
+        <w:rPr>
+          <w:rFonts w:ascii="Aptos" w:cs="Aptos" w:eastAsia="Aptos" w:hAnsi="Aptos"/>
+          <w:color w:val="000000"/>
+          <w:sz w:val="24"/>
+          <w:szCs w:val="24"/>
+          <w:rtl w:val="false"/>
+        </w:rPr>
+        <w:t xml:space="preserve">Simple.life (Simple App) — Software Developer</w:t>
       </w:r>
       <w:bookmarkEnd w:id="1"/>
+    </w:p>
+    <w:p>
+      <w:pPr>
+        <w:bidi w:val="false"/>
+        <w:spacing w:after="120" w:before="120" w:line="259.20000000000005"/>
+        <w:jc w:val="left"/>
+      </w:pPr>
+      <w:r>
+        <w:rPr>
+          <w:rFonts w:ascii="Aptos" w:cs="Aptos" w:eastAsia="Aptos" w:hAnsi="Aptos"/>
+          <w:color w:val="000000"/>
+          <w:sz w:val="24"/>
+          <w:szCs w:val="24"/>
+          <w:rtl w:val="false"/>
+        </w:rPr>
+        <w:t xml:space="preserve">November 2023 – July 2026</w:t>
+      </w:r>
+    </w:p>
+    <w:p>
+      <w:pPr>
+        <w:bidi w:val="false"/>
+        <w:spacing w:after="120" w:before="120" w:line="259.20000000000005"/>
+        <w:jc w:val="left"/>
+      </w:pPr>
+      <w:r>
+        <w:rPr>
+          <w:rFonts w:ascii="Aptos" w:cs="Aptos" w:eastAsia="Aptos" w:hAnsi="Aptos"/>
+          <w:color w:val="000000"/>
+          <w:sz w:val="24"/>
+          <w:szCs w:val="24"/>
+          <w:rtl w:val="false"/>
+        </w:rPr>
+        <w:t xml:space="preserve">Technologies: Go, Zendesk, Intercom, REST APIs, monitoring</w:t>
+      </w:r>
     </w:p>
     <w:p>
       <w:pPr>
@@ -233,16 +394,17 @@
           <w:numId w:val="1"/>
         </w:numPr>
         <w:bidi w:val="false"/>
-        <w:spacing w:after="120" w:before="120"/>
-      </w:pPr>
-      <w:r>
-        <w:rPr>
-          <w:color w:val="000000"/>
-          <w:sz w:val="24"/>
-          <w:szCs w:val="24"/>
-          <w:rtl w:val="false"/>
-        </w:rPr>
-        <w:t xml:space="preserve">Designed and owned a Go-based support-automation platform connecting customer-support tools and internal services.</w:t>
+        <w:spacing w:after="60" w:before="60"/>
+      </w:pPr>
+      <w:r>
+        <w:rPr>
+          <w:rFonts w:ascii="Aptos" w:cs="Aptos" w:eastAsia="Aptos" w:hAnsi="Aptos"/>
+          <w:color w:val="000000"/>
+          <w:sz w:val="24"/>
+          <w:szCs w:val="24"/>
+          <w:rtl w:val="false"/>
+        </w:rPr>
+        <w:t xml:space="preserve">Owned operation of a Go support platform handling 20,000+ tickets per ordinary month and up to three times that volume in U.S. peak season.</w:t>
       </w:r>
     </w:p>
     <w:p>
@@ -253,16 +415,17 @@
           <w:numId w:val="1"/>
         </w:numPr>
         <w:bidi w:val="false"/>
-        <w:spacing w:after="120" w:before="120"/>
-      </w:pPr>
-      <w:r>
-        <w:rPr>
-          <w:color w:val="000000"/>
-          <w:sz w:val="24"/>
-          <w:szCs w:val="24"/>
-          <w:rtl w:val="false"/>
-        </w:rPr>
-        <w:t xml:space="preserve">Engineered an API orchestration layer for ticket routing, classification, and lifecycle tracking across the support workflow.</w:t>
+        <w:spacing w:after="60" w:before="60"/>
+      </w:pPr>
+      <w:r>
+        <w:rPr>
+          <w:rFonts w:ascii="Aptos" w:cs="Aptos" w:eastAsia="Aptos" w:hAnsi="Aptos"/>
+          <w:color w:val="000000"/>
+          <w:sz w:val="24"/>
+          <w:szCs w:val="24"/>
+          <w:rtl w:val="false"/>
+        </w:rPr>
+        <w:t xml:space="preserve">Engineered a unified API orchestration layer that connected Zendesk, Intercom, and internal services for ticket routing, classification, and lifecycle tracking.</w:t>
       </w:r>
     </w:p>
     <w:p>
@@ -273,16 +436,71 @@
           <w:numId w:val="1"/>
         </w:numPr>
         <w:bidi w:val="false"/>
-        <w:spacing w:after="120" w:before="120"/>
-      </w:pPr>
-      <w:r>
-        <w:rPr>
-          <w:color w:val="000000"/>
-          <w:sz w:val="24"/>
-          <w:szCs w:val="24"/>
-          <w:rtl w:val="false"/>
-        </w:rPr>
-        <w:t xml:space="preserve">Integrated auto-triage flows that automated or deflected up to 30% of inbound tickets.</w:t>
+        <w:spacing w:after="60" w:before="60"/>
+      </w:pPr>
+      <w:r>
+        <w:rPr>
+          <w:rFonts w:ascii="Aptos" w:cs="Aptos" w:eastAsia="Aptos" w:hAnsi="Aptos"/>
+          <w:color w:val="000000"/>
+          <w:sz w:val="24"/>
+          <w:szCs w:val="24"/>
+          <w:rtl w:val="false"/>
+        </w:rPr>
+        <w:t xml:space="preserve">Contributed multiple automation scenarios to a platform that now handles up to 86% through full automation, measured via Intercom internal and backend Grafana metrics.</w:t>
+      </w:r>
+    </w:p>
+    <w:p>
+      <w:pPr>
+        <w:pStyle w:val="3"/>
+        <w:pStyle w:val="Heading3"/>
+        <w:bidi w:val="false"/>
+        <w:spacing w:after="120" w:before="240"/>
+      </w:pPr>
+      <w:bookmarkStart w:name="_Toc_CRURATED_PHP_Software_Developer_concurre_6" w:id="1"/>
+      <w:r>
+        <w:rPr>
+          <w:rFonts w:ascii="Aptos" w:cs="Aptos" w:eastAsia="Aptos" w:hAnsi="Aptos"/>
+          <w:color w:val="000000"/>
+          <w:sz w:val="24"/>
+          <w:szCs w:val="24"/>
+          <w:rtl w:val="false"/>
+        </w:rPr>
+        <w:t xml:space="preserve">CRURATED — PHP Software Developer, concurrent part-time subcontract / consulting engagement</w:t>
+      </w:r>
+      <w:bookmarkEnd w:id="1"/>
+    </w:p>
+    <w:p>
+      <w:pPr>
+        <w:bidi w:val="false"/>
+        <w:spacing w:after="120" w:before="120" w:line="259.20000000000005"/>
+        <w:jc w:val="left"/>
+      </w:pPr>
+      <w:r>
+        <w:rPr>
+          <w:rFonts w:ascii="Aptos" w:cs="Aptos" w:eastAsia="Aptos" w:hAnsi="Aptos"/>
+          <w:color w:val="000000"/>
+          <w:sz w:val="24"/>
+          <w:szCs w:val="24"/>
+          <w:rtl w:val="false"/>
+        </w:rPr>
+        <w:t xml:space="preserve">August 2024 – January 2026</w:t>
+      </w:r>
+    </w:p>
+    <w:p>
+      <w:pPr>
+        <w:bidi w:val="false"/>
+        <w:spacing w:after="120" w:before="120" w:line="259.20000000000005"/>
+        <w:jc w:val="left"/>
+      </w:pPr>
+      <w:r>
+        <w:rPr>
+          <w:rFonts w:ascii="Aptos" w:cs="Aptos" w:eastAsia="Aptos" w:hAnsi="Aptos"/>
+          <w:color w:val="000000"/>
+          <w:sz w:val="24"/>
+          <w:szCs w:val="24"/>
+          <w:rtl w:val="false"/>
+        </w:rPr>
+        <w:t xml:space="preserve">Technologies: PHP, AWS EventBridge, queues, Webhook, S3</w:t>
       </w:r>
     </w:p>
     <w:p>
@@ -293,16 +511,17 @@
           <w:numId w:val="1"/>
         </w:numPr>
         <w:bidi w:val="false"/>
-        <w:spacing w:after="120" w:before="120"/>
-      </w:pPr>
-      <w:r>
-        <w:rPr>
-          <w:color w:val="000000"/>
-          <w:sz w:val="24"/>
-          <w:szCs w:val="24"/>
-          <w:rtl w:val="false"/>
-        </w:rPr>
-        <w:t xml:space="preserve">Contributed to an LLM-assisted support agent for email and multilingual workflows, expanding automation coverage and enabling new support scenarios with less engineering involvement.</w:t>
+        <w:spacing w:after="60" w:before="60"/>
+      </w:pPr>
+      <w:r>
+        <w:rPr>
+          <w:rFonts w:ascii="Aptos" w:cs="Aptos" w:eastAsia="Aptos" w:hAnsi="Aptos"/>
+          <w:color w:val="000000"/>
+          <w:sz w:val="24"/>
+          <w:szCs w:val="24"/>
+          <w:rtl w:val="false"/>
+        </w:rPr>
+        <w:t xml:space="preserve">Architected and led internal event analytics infrastructure used for product metrics, reporting, and business insights.</w:t>
       </w:r>
     </w:p>
     <w:p>
@@ -313,32 +532,17 @@
           <w:numId w:val="1"/>
         </w:numPr>
         <w:bidi w:val="false"/>
-        <w:spacing w:after="120" w:before="120"/>
-      </w:pPr>
-      <w:r>
-        <w:rPr>
-          <w:color w:val="000000"/>
-          <w:sz w:val="24"/>
-          <w:szCs w:val="24"/>
-          <w:rtl w:val="false"/>
-        </w:rPr>
-        <w:t xml:space="preserve">Worked with Support Operations, Product, and AI teams to align automation changes with measurable support outcomes.</w:t>
-      </w:r>
-    </w:p>
-    <w:p>
-      <w:pPr>
-        <w:bidi w:val="false"/>
-        <w:spacing w:after="240" w:before="240" w:line="276"/>
-        <w:jc w:val="left"/>
-      </w:pPr>
-      <w:r>
-        <w:rPr>
-          <w:color w:val="000000"/>
-          <w:sz w:val="24"/>
-          <w:szCs w:val="24"/>
-          <w:rtl w:val="false"/>
-        </w:rPr>
-        <w:t xml:space="preserve">Technologies: Go, backend integrations, REST APIs, monitoring.</w:t>
+        <w:spacing w:after="60" w:before="60"/>
+      </w:pPr>
+      <w:r>
+        <w:rPr>
+          <w:rFonts w:ascii="Aptos" w:cs="Aptos" w:eastAsia="Aptos" w:hAnsi="Aptos"/>
+          <w:color w:val="000000"/>
+          <w:sz w:val="24"/>
+          <w:szCs w:val="24"/>
+          <w:rtl w:val="false"/>
+        </w:rPr>
+        <w:t xml:space="preserve">Defined a versioned event schema and routing to Webhook and S3, maintaining cross-team consistency with delivery guarantees and backpressure handling.</w:t>
       </w:r>
     </w:p>
     <w:p>
@@ -348,17 +552,52 @@
         <w:bidi w:val="false"/>
         <w:spacing w:after="120" w:before="240"/>
       </w:pPr>
-      <w:bookmarkStart w:name="_Toc_airSlate_Software_Developer_Technical_Le_6" w:id="1"/>
-      <w:r>
-        <w:rPr>
-          <w:color w:val="000000"/>
-          <w:sz w:val="24"/>
-          <w:szCs w:val="24"/>
-          <w:rtl w:val="false"/>
-        </w:rPr>
-        <w:t xml:space="preserve">airSlate — Software Developer / Technical Lead | February 2021–August 2023</w:t>
+      <w:bookmarkStart w:name="_Toc_airSlate_Technical_Lead_Senior_Software__7" w:id="1"/>
+      <w:r>
+        <w:rPr>
+          <w:rFonts w:ascii="Aptos" w:cs="Aptos" w:eastAsia="Aptos" w:hAnsi="Aptos"/>
+          <w:color w:val="000000"/>
+          <w:sz w:val="24"/>
+          <w:szCs w:val="24"/>
+          <w:rtl w:val="false"/>
+        </w:rPr>
+        <w:t xml:space="preserve">airSlate — Technical Lead / Senior Software Developer</w:t>
       </w:r>
       <w:bookmarkEnd w:id="1"/>
+    </w:p>
+    <w:p>
+      <w:pPr>
+        <w:bidi w:val="false"/>
+        <w:spacing w:after="120" w:before="120" w:line="259.20000000000005"/>
+        <w:jc w:val="left"/>
+      </w:pPr>
+      <w:r>
+        <w:rPr>
+          <w:rFonts w:ascii="Aptos" w:cs="Aptos" w:eastAsia="Aptos" w:hAnsi="Aptos"/>
+          <w:color w:val="000000"/>
+          <w:sz w:val="24"/>
+          <w:szCs w:val="24"/>
+          <w:rtl w:val="false"/>
+        </w:rPr>
+        <w:t xml:space="preserve">February 2021 – August 2023</w:t>
+      </w:r>
+    </w:p>
+    <w:p>
+      <w:pPr>
+        <w:bidi w:val="false"/>
+        <w:spacing w:after="120" w:before="120" w:line="259.20000000000005"/>
+        <w:jc w:val="left"/>
+      </w:pPr>
+      <w:r>
+        <w:rPr>
+          <w:rFonts w:ascii="Aptos" w:cs="Aptos" w:eastAsia="Aptos" w:hAnsi="Aptos"/>
+          <w:color w:val="000000"/>
+          <w:sz w:val="24"/>
+          <w:szCs w:val="24"/>
+          <w:rtl w:val="false"/>
+        </w:rPr>
+        <w:t xml:space="preserve">Technologies: PHP, Laravel, Symfony, MySQL, Prometheus, REST APIs</w:t>
+      </w:r>
     </w:p>
     <w:p>
       <w:pPr>
@@ -368,16 +607,17 @@
           <w:numId w:val="1"/>
         </w:numPr>
         <w:bidi w:val="false"/>
-        <w:spacing w:after="120" w:before="120"/>
-      </w:pPr>
-      <w:r>
-        <w:rPr>
-          <w:color w:val="000000"/>
-          <w:sz w:val="24"/>
-          <w:szCs w:val="24"/>
-          <w:rtl w:val="false"/>
-        </w:rPr>
-        <w:t xml:space="preserve">Reduced peak load on the main database by redistributing workload, improving service stability during high-traffic periods.</w:t>
+        <w:spacing w:after="60" w:before="60"/>
+      </w:pPr>
+      <w:r>
+        <w:rPr>
+          <w:rFonts w:ascii="Aptos" w:cs="Aptos" w:eastAsia="Aptos" w:hAnsi="Aptos"/>
+          <w:color w:val="000000"/>
+          <w:sz w:val="24"/>
+          <w:szCs w:val="24"/>
+          <w:rtl w:val="false"/>
+        </w:rPr>
+        <w:t xml:space="preserve">Reduced peak database load by removing bottlenecks and redistributing work, improving service stability during high-traffic periods.</w:t>
       </w:r>
     </w:p>
     <w:p>
@@ -388,16 +628,71 @@
           <w:numId w:val="1"/>
         </w:numPr>
         <w:bidi w:val="false"/>
-        <w:spacing w:after="120" w:before="120"/>
-      </w:pPr>
-      <w:r>
-        <w:rPr>
-          <w:color w:val="000000"/>
-          <w:sz w:val="24"/>
-          <w:szCs w:val="24"/>
-          <w:rtl w:val="false"/>
-        </w:rPr>
-        <w:t xml:space="preserve">Developed a Laravel/Symfony product-wide logger package aligned with an interservice-communication standard.</w:t>
+        <w:spacing w:after="60" w:before="60"/>
+      </w:pPr>
+      <w:r>
+        <w:rPr>
+          <w:rFonts w:ascii="Aptos" w:cs="Aptos" w:eastAsia="Aptos" w:hAnsi="Aptos"/>
+          <w:color w:val="000000"/>
+          <w:sz w:val="24"/>
+          <w:szCs w:val="24"/>
+          <w:rtl w:val="false"/>
+        </w:rPr>
+        <w:t xml:space="preserve">Built a Laravel/Symfony product-wide logger package that followed the interservice communication standard.</w:t>
+      </w:r>
+    </w:p>
+    <w:p>
+      <w:pPr>
+        <w:pStyle w:val="3"/>
+        <w:pStyle w:val="Heading3"/>
+        <w:bidi w:val="false"/>
+        <w:spacing w:after="120" w:before="240"/>
+      </w:pPr>
+      <w:bookmarkStart w:name="_Toc_Hyprr_Technical_Lead_8" w:id="1"/>
+      <w:r>
+        <w:rPr>
+          <w:rFonts w:ascii="Aptos" w:cs="Aptos" w:eastAsia="Aptos" w:hAnsi="Aptos"/>
+          <w:color w:val="000000"/>
+          <w:sz w:val="24"/>
+          <w:szCs w:val="24"/>
+          <w:rtl w:val="false"/>
+        </w:rPr>
+        <w:t xml:space="preserve">Hyprr — Technical Lead</w:t>
+      </w:r>
+      <w:bookmarkEnd w:id="1"/>
+    </w:p>
+    <w:p>
+      <w:pPr>
+        <w:bidi w:val="false"/>
+        <w:spacing w:after="120" w:before="120" w:line="259.20000000000005"/>
+        <w:jc w:val="left"/>
+      </w:pPr>
+      <w:r>
+        <w:rPr>
+          <w:rFonts w:ascii="Aptos" w:cs="Aptos" w:eastAsia="Aptos" w:hAnsi="Aptos"/>
+          <w:color w:val="000000"/>
+          <w:sz w:val="24"/>
+          <w:szCs w:val="24"/>
+          <w:rtl w:val="false"/>
+        </w:rPr>
+        <w:t xml:space="preserve">November 2019 – January 2021</w:t>
+      </w:r>
+    </w:p>
+    <w:p>
+      <w:pPr>
+        <w:bidi w:val="false"/>
+        <w:spacing w:after="120" w:before="120" w:line="259.20000000000005"/>
+        <w:jc w:val="left"/>
+      </w:pPr>
+      <w:r>
+        <w:rPr>
+          <w:rFonts w:ascii="Aptos" w:cs="Aptos" w:eastAsia="Aptos" w:hAnsi="Aptos"/>
+          <w:color w:val="000000"/>
+          <w:sz w:val="24"/>
+          <w:szCs w:val="24"/>
+          <w:rtl w:val="false"/>
+        </w:rPr>
+        <w:t xml:space="preserve">Technologies: PHP, Go, AWS, microservices, CI/CD</w:t>
       </w:r>
     </w:p>
     <w:p>
@@ -408,16 +703,71 @@
           <w:numId w:val="1"/>
         </w:numPr>
         <w:bidi w:val="false"/>
-        <w:spacing w:after="120" w:before="120"/>
-      </w:pPr>
-      <w:r>
-        <w:rPr>
-          <w:color w:val="000000"/>
-          <w:sz w:val="24"/>
-          <w:szCs w:val="24"/>
-          <w:rtl w:val="false"/>
-        </w:rPr>
-        <w:t xml:space="preserve">Delivered team assignments from initial draft through production release, coordinating scope, planning, and delivery across the project lifecycle.</w:t>
+        <w:spacing w:after="60" w:before="60"/>
+      </w:pPr>
+      <w:r>
+        <w:rPr>
+          <w:rFonts w:ascii="Aptos" w:cs="Aptos" w:eastAsia="Aptos" w:hAnsi="Aptos"/>
+          <w:color w:val="000000"/>
+          <w:sz w:val="24"/>
+          <w:szCs w:val="24"/>
+          <w:rtl w:val="false"/>
+        </w:rPr>
+        <w:t xml:space="preserve">Took a Web3 social and NFT product from prototype to closed beta in less than six months, setting its technical roadmap with the CTO.</w:t>
+      </w:r>
+    </w:p>
+    <w:p>
+      <w:pPr>
+        <w:pStyle w:val="3"/>
+        <w:pStyle w:val="Heading3"/>
+        <w:bidi w:val="false"/>
+        <w:spacing w:after="120" w:before="240"/>
+      </w:pPr>
+      <w:bookmarkStart w:name="_Toc_PDFfiller_Software_Developer_9" w:id="1"/>
+      <w:r>
+        <w:rPr>
+          <w:rFonts w:ascii="Aptos" w:cs="Aptos" w:eastAsia="Aptos" w:hAnsi="Aptos"/>
+          <w:color w:val="000000"/>
+          <w:sz w:val="24"/>
+          <w:szCs w:val="24"/>
+          <w:rtl w:val="false"/>
+        </w:rPr>
+        <w:t xml:space="preserve">PDFfiller — Software Developer</w:t>
+      </w:r>
+      <w:bookmarkEnd w:id="1"/>
+    </w:p>
+    <w:p>
+      <w:pPr>
+        <w:bidi w:val="false"/>
+        <w:spacing w:after="120" w:before="120" w:line="259.20000000000005"/>
+        <w:jc w:val="left"/>
+      </w:pPr>
+      <w:r>
+        <w:rPr>
+          <w:rFonts w:ascii="Aptos" w:cs="Aptos" w:eastAsia="Aptos" w:hAnsi="Aptos"/>
+          <w:color w:val="000000"/>
+          <w:sz w:val="24"/>
+          <w:szCs w:val="24"/>
+          <w:rtl w:val="false"/>
+        </w:rPr>
+        <w:t xml:space="preserve">October 2016 – November 2019</w:t>
+      </w:r>
+    </w:p>
+    <w:p>
+      <w:pPr>
+        <w:bidi w:val="false"/>
+        <w:spacing w:after="120" w:before="120" w:line="259.20000000000005"/>
+        <w:jc w:val="left"/>
+      </w:pPr>
+      <w:r>
+        <w:rPr>
+          <w:rFonts w:ascii="Aptos" w:cs="Aptos" w:eastAsia="Aptos" w:hAnsi="Aptos"/>
+          <w:color w:val="000000"/>
+          <w:sz w:val="24"/>
+          <w:szCs w:val="24"/>
+          <w:rtl w:val="false"/>
+        </w:rPr>
+        <w:t xml:space="preserve">Technologies: PHP, Laravel, MySQL, RabbitMQ, AWS, email infrastructure</w:t>
       </w:r>
     </w:p>
     <w:p>
@@ -428,16 +778,17 @@
           <w:numId w:val="1"/>
         </w:numPr>
         <w:bidi w:val="false"/>
-        <w:spacing w:after="120" w:before="120"/>
-      </w:pPr>
-      <w:r>
-        <w:rPr>
-          <w:color w:val="000000"/>
-          <w:sz w:val="24"/>
-          <w:szCs w:val="24"/>
-          <w:rtl w:val="false"/>
-        </w:rPr>
-        <w:t xml:space="preserve">Contributed to Agile planning, release roadmaps, and task distribution across planning intervals.</w:t>
+        <w:spacing w:after="60" w:before="60"/>
+      </w:pPr>
+      <w:r>
+        <w:rPr>
+          <w:rFonts w:ascii="Aptos" w:cs="Aptos" w:eastAsia="Aptos" w:hAnsi="Aptos"/>
+          <w:color w:val="000000"/>
+          <w:sz w:val="24"/>
+          <w:szCs w:val="24"/>
+          <w:rtl w:val="false"/>
+        </w:rPr>
+        <w:t xml:space="preserve">Led five backend engineers developing a transactional email service that handled about 3 million emails in an ordinary month.</w:t>
       </w:r>
     </w:p>
     <w:p>
@@ -448,222 +799,17 @@
           <w:numId w:val="1"/>
         </w:numPr>
         <w:bidi w:val="false"/>
-        <w:spacing w:after="120" w:before="120"/>
-      </w:pPr>
-      <w:r>
-        <w:rPr>
-          <w:color w:val="000000"/>
-          <w:sz w:val="24"/>
-          <w:szCs w:val="24"/>
-          <w:rtl w:val="false"/>
-        </w:rPr>
-        <w:t xml:space="preserve">Investigated production issues through logs, monitoring, and SRE dashboards, then delivered fixes and operational improvements.</w:t>
-      </w:r>
-    </w:p>
-    <w:p>
-      <w:pPr>
-        <w:bidi w:val="false"/>
-        <w:spacing w:after="240" w:before="240" w:line="276"/>
-        <w:jc w:val="left"/>
-      </w:pPr>
-      <w:r>
-        <w:rPr>
-          <w:color w:val="000000"/>
-          <w:sz w:val="24"/>
-          <w:szCs w:val="24"/>
-          <w:rtl w:val="false"/>
-        </w:rPr>
-        <w:t xml:space="preserve">Technologies: PHP, Laravel, Symfony, MySQL, Elasticsearch, RabbitMQ, AWS, REST APIs, CI/CD.</w:t>
-      </w:r>
-    </w:p>
-    <w:p>
-      <w:pPr>
-        <w:pStyle w:val="3"/>
-        <w:pStyle w:val="Heading3"/>
-        <w:bidi w:val="false"/>
-        <w:spacing w:after="120" w:before="240"/>
-      </w:pPr>
-      <w:bookmarkStart w:name="_Toc_Hyprr_Technical_Lead_November_2019Januar_7" w:id="1"/>
-      <w:r>
-        <w:rPr>
-          <w:color w:val="000000"/>
-          <w:sz w:val="24"/>
-          <w:szCs w:val="24"/>
-          <w:rtl w:val="false"/>
-        </w:rPr>
-        <w:t xml:space="preserve">Hyprr — Technical Lead | November 2019–January 2021</w:t>
-      </w:r>
-      <w:bookmarkEnd w:id="1"/>
-    </w:p>
-    <w:p>
-      <w:pPr>
-        <w:pStyle w:val="ListParagraph"/>
-        <w:numPr>
-          <w:ilvl w:val="0"/>
-          <w:numId w:val="1"/>
-        </w:numPr>
-        <w:bidi w:val="false"/>
-        <w:spacing w:after="120" w:before="120"/>
-      </w:pPr>
-      <w:r>
-        <w:rPr>
-          <w:color w:val="000000"/>
-          <w:sz w:val="24"/>
-          <w:szCs w:val="24"/>
-          <w:rtl w:val="false"/>
-        </w:rPr>
-        <w:t xml:space="preserve">Helped bring a creator-focused digital product from prototype to closed beta in under six months.</w:t>
-      </w:r>
-    </w:p>
-    <w:p>
-      <w:pPr>
-        <w:pStyle w:val="ListParagraph"/>
-        <w:numPr>
-          <w:ilvl w:val="0"/>
-          <w:numId w:val="1"/>
-        </w:numPr>
-        <w:bidi w:val="false"/>
-        <w:spacing w:after="120" w:before="120"/>
-      </w:pPr>
-      <w:r>
-        <w:rPr>
-          <w:color w:val="000000"/>
-          <w:sz w:val="24"/>
-          <w:szCs w:val="24"/>
-          <w:rtl w:val="false"/>
-        </w:rPr>
-        <w:t xml:space="preserve">Defined the technology roadmap with the CTO and led backend development across microservice and serverless architecture decisions.</w:t>
-      </w:r>
-    </w:p>
-    <w:p>
-      <w:pPr>
-        <w:pStyle w:val="ListParagraph"/>
-        <w:numPr>
-          <w:ilvl w:val="0"/>
-          <w:numId w:val="1"/>
-        </w:numPr>
-        <w:bidi w:val="false"/>
-        <w:spacing w:after="120" w:before="120"/>
-      </w:pPr>
-      <w:r>
-        <w:rPr>
-          <w:color w:val="000000"/>
-          <w:sz w:val="24"/>
-          <w:szCs w:val="24"/>
-          <w:rtl w:val="false"/>
-        </w:rPr>
-        <w:t xml:space="preserve">Influenced project planning, CI/CD, reliability, and serviceability decisions as the product moved toward closed beta.</w:t>
-      </w:r>
-    </w:p>
-    <w:p>
-      <w:pPr>
-        <w:bidi w:val="false"/>
-        <w:spacing w:after="240" w:before="240" w:line="276"/>
-        <w:jc w:val="left"/>
-      </w:pPr>
-      <w:r>
-        <w:rPr>
-          <w:color w:val="000000"/>
-          <w:sz w:val="24"/>
-          <w:szCs w:val="24"/>
-          <w:rtl w:val="false"/>
-        </w:rPr>
-        <w:t xml:space="preserve">Technologies: PHP, Go, Laravel, MySQL, AWS, microservices, REST APIs, CI/CD.</w:t>
-      </w:r>
-    </w:p>
-    <w:p>
-      <w:pPr>
-        <w:pStyle w:val="3"/>
-        <w:pStyle w:val="Heading3"/>
-        <w:bidi w:val="false"/>
-        <w:spacing w:after="120" w:before="240"/>
-      </w:pPr>
-      <w:bookmarkStart w:name="_Toc_PDFfiller_Software_Developer_October_201_8" w:id="1"/>
-      <w:r>
-        <w:rPr>
-          <w:color w:val="000000"/>
-          <w:sz w:val="24"/>
-          <w:szCs w:val="24"/>
-          <w:rtl w:val="false"/>
-        </w:rPr>
-        <w:t xml:space="preserve">PDFfiller — Software Developer | October 2016–November 2019</w:t>
-      </w:r>
-      <w:bookmarkEnd w:id="1"/>
-    </w:p>
-    <w:p>
-      <w:pPr>
-        <w:pStyle w:val="ListParagraph"/>
-        <w:numPr>
-          <w:ilvl w:val="0"/>
-          <w:numId w:val="1"/>
-        </w:numPr>
-        <w:bidi w:val="false"/>
-        <w:spacing w:after="120" w:before="120"/>
-      </w:pPr>
-      <w:r>
-        <w:rPr>
-          <w:color w:val="000000"/>
-          <w:sz w:val="24"/>
-          <w:szCs w:val="24"/>
-          <w:rtl w:val="false"/>
-        </w:rPr>
-        <w:t xml:space="preserve">Led a team of five backend engineers developing a transactional-email service.</w:t>
-      </w:r>
-    </w:p>
-    <w:p>
-      <w:pPr>
-        <w:pStyle w:val="ListParagraph"/>
-        <w:numPr>
-          <w:ilvl w:val="0"/>
-          <w:numId w:val="1"/>
-        </w:numPr>
-        <w:bidi w:val="false"/>
-        <w:spacing w:after="120" w:before="120"/>
-      </w:pPr>
-      <w:r>
-        <w:rPr>
-          <w:color w:val="000000"/>
-          <w:sz w:val="24"/>
-          <w:szCs w:val="24"/>
-          <w:rtl w:val="false"/>
-        </w:rPr>
-        <w:t xml:space="preserve">Scaled the service to around 50 million emails per month and built deep expertise in DNS, DKIM, SPF, DMARC, and feedback loops.</w:t>
-      </w:r>
-    </w:p>
-    <w:p>
-      <w:pPr>
-        <w:pStyle w:val="ListParagraph"/>
-        <w:numPr>
-          <w:ilvl w:val="0"/>
-          <w:numId w:val="1"/>
-        </w:numPr>
-        <w:bidi w:val="false"/>
-        <w:spacing w:after="120" w:before="120"/>
-      </w:pPr>
-      <w:r>
-        <w:rPr>
-          <w:color w:val="000000"/>
-          <w:sz w:val="24"/>
-          <w:szCs w:val="24"/>
-          <w:rtl w:val="false"/>
-        </w:rPr>
-        <w:t xml:space="preserve">Led the team through Black Friday/Cyber Monday peak periods, when customer traffic grew more than tenfold.</w:t>
-      </w:r>
-    </w:p>
-    <w:p>
-      <w:pPr>
-        <w:bidi w:val="false"/>
-        <w:spacing w:after="240" w:before="240" w:line="276"/>
-        <w:jc w:val="left"/>
-      </w:pPr>
-      <w:r>
-        <w:rPr>
-          <w:color w:val="000000"/>
-          <w:sz w:val="24"/>
-          <w:szCs w:val="24"/>
-          <w:rtl w:val="false"/>
-        </w:rPr>
-        <w:t xml:space="preserve">Technologies: PHP, Laravel, MySQL, Elasticsearch, RabbitMQ, AWS, email infrastructure, REST APIs.</w:t>
+        <w:spacing w:after="60" w:before="60"/>
+      </w:pPr>
+      <w:r>
+        <w:rPr>
+          <w:rFonts w:ascii="Aptos" w:cs="Aptos" w:eastAsia="Aptos" w:hAnsi="Aptos"/>
+          <w:color w:val="000000"/>
+          <w:sz w:val="24"/>
+          <w:szCs w:val="24"/>
+          <w:rtl w:val="false"/>
+        </w:rPr>
+        <w:t xml:space="preserve">Guided the transactional-email team through BFCM periods at up to ten times ordinary-month volume.</w:t>
       </w:r>
     </w:p>
     <w:p>
@@ -673,9 +819,10 @@
         <w:bidi w:val="false"/>
         <w:spacing w:after="120" w:before="240"/>
       </w:pPr>
-      <w:bookmarkStart w:name="_Toc_Education_9" w:id="1"/>
-      <w:r>
-        <w:rPr>
+      <w:bookmarkStart w:name="_Toc_Education_10" w:id="1"/>
+      <w:r>
+        <w:rPr>
+          <w:rFonts w:ascii="Aptos" w:cs="Aptos" w:eastAsia="Aptos" w:hAnsi="Aptos"/>
           <w:color w:val="000000"/>
           <w:sz w:val="28"/>
           <w:szCs w:val="28"/>
@@ -688,17 +835,18 @@
     <w:p>
       <w:pPr>
         <w:bidi w:val="false"/>
-        <w:spacing w:after="240" w:before="240" w:line="276"/>
-        <w:jc w:val="left"/>
-      </w:pPr>
-      <w:r>
-        <w:rPr>
-          <w:color w:val="000000"/>
-          <w:sz w:val="24"/>
-          <w:szCs w:val="24"/>
-          <w:rtl w:val="false"/>
-        </w:rPr>
-        <w:t xml:space="preserve">Master's degree in Computer Science, National Technical University, Kharkiv, Ukraine | 2003–2008</w:t>
+        <w:spacing w:after="120" w:before="120" w:line="259.20000000000005"/>
+        <w:jc w:val="left"/>
+      </w:pPr>
+      <w:r>
+        <w:rPr>
+          <w:rFonts w:ascii="Aptos" w:cs="Aptos" w:eastAsia="Aptos" w:hAnsi="Aptos"/>
+          <w:color w:val="000000"/>
+          <w:sz w:val="24"/>
+          <w:szCs w:val="24"/>
+          <w:rtl w:val="false"/>
+        </w:rPr>
+        <w:t xml:space="preserve">Master of Computer Applications, National Technical University "Kharkiv Polytechnic Institute", 2003–2008</w:t>
       </w:r>
     </w:p>
     <w:p>
@@ -708,9 +856,10 @@
         <w:bidi w:val="false"/>
         <w:spacing w:after="120" w:before="240"/>
       </w:pPr>
-      <w:bookmarkStart w:name="_Toc_Languages_10" w:id="1"/>
-      <w:r>
-        <w:rPr>
+      <w:bookmarkStart w:name="_Toc_Languages_11" w:id="1"/>
+      <w:r>
+        <w:rPr>
+          <w:rFonts w:ascii="Aptos" w:cs="Aptos" w:eastAsia="Aptos" w:hAnsi="Aptos"/>
           <w:color w:val="000000"/>
           <w:sz w:val="28"/>
           <w:szCs w:val="28"/>
@@ -723,17 +872,18 @@
     <w:p>
       <w:pPr>
         <w:bidi w:val="false"/>
-        <w:spacing w:after="240" w:before="240" w:line="276"/>
-        <w:jc w:val="left"/>
-      </w:pPr>
-      <w:r>
-        <w:rPr>
-          <w:color w:val="000000"/>
-          <w:sz w:val="24"/>
-          <w:szCs w:val="24"/>
-          <w:rtl w:val="false"/>
-        </w:rPr>
-        <w:t xml:space="preserve">Ukrainian: native | English: upper-intermediate</w:t>
+        <w:spacing w:after="120" w:before="120" w:line="259.20000000000005"/>
+        <w:jc w:val="left"/>
+      </w:pPr>
+      <w:r>
+        <w:rPr>
+          <w:rFonts w:ascii="Aptos" w:cs="Aptos" w:eastAsia="Aptos" w:hAnsi="Aptos"/>
+          <w:color w:val="000000"/>
+          <w:sz w:val="24"/>
+          <w:szCs w:val="24"/>
+          <w:rtl w:val="false"/>
+        </w:rPr>
+        <w:t xml:space="preserve">Ukrainian — Native | English — Upper-intermediate | Russian — Native or Bilingual</w:t>
       </w:r>
     </w:p>
     <w:sectPr>
@@ -797,6 +947,7 @@
     </w:pPr>
     <w:r>
       <w:rPr>
+        <w:rFonts w:ascii="Aptos" w:cs="Aptos" w:eastAsia="Aptos" w:hAnsi="Aptos"/>
         <w:sz w:val="24"/>
         <w:szCs w:val="24"/>
         <w:rtl w:val="false"/>
@@ -1125,10 +1276,11 @@
     <w:next w:val="Normal"/>
     <w:qFormat/>
     <w:pPr>
-      <w:spacing w:after="240" w:line="276"/>
+      <w:spacing w:after="240" w:line="259.20000000000005"/>
       <w:jc w:val="center"/>
     </w:pPr>
     <w:rPr>
+      <w:rFonts w:ascii="Aptos" w:cs="Aptos" w:eastAsia="Aptos" w:hAnsi="Aptos"/>
       <w:b/>
       <w:bCs/>
       <w:color w:val="000000"/>
@@ -1146,6 +1298,7 @@
       <w:outlineLvl w:val="1"/>
     </w:pPr>
     <w:rPr>
+      <w:rFonts w:ascii="Aptos" w:cs="Aptos" w:eastAsia="Aptos" w:hAnsi="Aptos"/>
       <w:b/>
       <w:bCs/>
       <w:color w:val="000000"/>
@@ -1163,6 +1316,7 @@
       <w:outlineLvl w:val="2"/>
     </w:pPr>
     <w:rPr>
+      <w:rFonts w:ascii="Aptos" w:cs="Aptos" w:eastAsia="Aptos" w:hAnsi="Aptos"/>
       <w:b/>
       <w:bCs/>
       <w:color w:val="000000"/>
@@ -1180,6 +1334,7 @@
       <w:outlineLvl w:val="3"/>
     </w:pPr>
     <w:rPr>
+      <w:rFonts w:ascii="Aptos" w:cs="Aptos" w:eastAsia="Aptos" w:hAnsi="Aptos"/>
       <w:b/>
       <w:bCs/>
       <w:color w:val="000000"/>
@@ -1197,6 +1352,7 @@
       <w:outlineLvl w:val="4"/>
     </w:pPr>
     <w:rPr>
+      <w:rFonts w:ascii="Aptos" w:cs="Aptos" w:eastAsia="Aptos" w:hAnsi="Aptos"/>
       <w:b/>
       <w:bCs/>
       <w:color w:val="000000"/>
@@ -1214,6 +1370,7 @@
       <w:outlineLvl w:val="5"/>
     </w:pPr>
     <w:rPr>
+      <w:rFonts w:ascii="Aptos" w:cs="Aptos" w:eastAsia="Aptos" w:hAnsi="Aptos"/>
       <w:b/>
       <w:bCs/>
       <w:color w:val="000000"/>
@@ -1231,6 +1388,7 @@
       <w:outlineLvl w:val="6"/>
     </w:pPr>
     <w:rPr>
+      <w:rFonts w:ascii="Aptos" w:cs="Aptos" w:eastAsia="Aptos" w:hAnsi="Aptos"/>
       <w:b/>
       <w:bCs/>
       <w:color w:val="000000"/>
@@ -1241,6 +1399,7 @@
   <w:style w:type="paragraph" w:styleId="Strong">
     <w:name w:val="Strong"/>
     <w:rPr>
+      <w:rFonts w:ascii="Aptos" w:cs="Aptos" w:eastAsia="Aptos" w:hAnsi="Aptos"/>
       <w:b/>
       <w:bCs/>
     </w:rPr>

</xml_diff>

<commit_message>
Strengthen senior CV evidence and refresh ZFORT and IT Delight applications
Preserve CRURATED work history and candidate confirmations as sourced records; add role-level CV editorial checks and a narrow existing-CV score override. Refresh only the two selected CVs and their manifests.

Verification: 473 unit tests passed (19 skipped); both application drafts validated; evidence bank validated; DOCX content and two-page render reviewed; prohibited API integration scan found no matches.
</commit_message>
<xml_diff>
--- a/registry/jobs/2026-09-23_135953_it-delight_senior-go-developer/application/CV_ValentinNikolaev_itdelight_SeniorGoDeveloper.docx
+++ b/registry/jobs/2026-09-23_135953_it-delight_senior-go-developer/application/CV_ValentinNikolaev_itdelight_SeniorGoDeveloper.docx
@@ -55,7 +55,7 @@
         </w:rPr>
         <w:t xml:space="preserve">Rome, Italy | </w:t>
       </w:r>
-      <w:hyperlink w:history="1" r:id="rIdfzelxsfs0hfyjzzamjgsy">
+      <w:hyperlink w:history="1" r:id="rIdj6cwhgnhaa1n3wxdqui5p">
         <w:r>
           <w:rPr>
             <w:rFonts w:ascii="Aptos" w:cs="Aptos" w:eastAsia="Aptos" w:hAnsi="Aptos"/>
@@ -95,7 +95,7 @@
         </w:rPr>
         <w:t xml:space="preserve">LinkedIn: </w:t>
       </w:r>
-      <w:hyperlink w:history="1" r:id="rIdyq4_glhnirhc1q5yt8stv">
+      <w:hyperlink w:history="1" r:id="rId-_4tlp41hpc6pdmnfnksw">
         <w:r>
           <w:rPr>
             <w:rFonts w:ascii="Aptos" w:cs="Aptos" w:eastAsia="Aptos" w:hAnsi="Aptos"/>
@@ -125,7 +125,7 @@
         </w:rPr>
         <w:t xml:space="preserve">GitHub: </w:t>
       </w:r>
-      <w:hyperlink w:history="1" r:id="rIdfjmcmgk7yw2wd_o2yfmde">
+      <w:hyperlink w:history="1" r:id="rId7kh-_ezsuxmmfqohvtlsk">
         <w:r>
           <w:rPr>
             <w:rFonts w:ascii="Aptos" w:cs="Aptos" w:eastAsia="Aptos" w:hAnsi="Aptos"/>
@@ -173,7 +173,7 @@
           <w:szCs w:val="24"/>
           <w:rtl w:val="false"/>
         </w:rPr>
-        <w:t xml:space="preserve">Senior backend engineer with 15+ years building Go and PHP production systems. Owned operation of a Go support platform at 20,000+ tickets per ordinary month and up to three times that volume in U.S. peak season. Architected event-driven analytics infrastructure with versioned schemas and reliable downstream routing, and earlier delivered a product from prototype to closed beta and led transactional-email engineering through BFCM peak demand.</w:t>
+        <w:t xml:space="preserve">Senior backend engineer with 15+ years building Go and PHP production systems. Personally owned a Go support platform handling at least 20,000 tickets per ordinary month and up to three times that volume in U.S. peak season. Delivered API orchestration and production event analytics with versioned delivery, combining hands-on engineering and technical leadership for complex integrations and reliable services.</w:t>
       </w:r>
     </w:p>
     <w:p>
@@ -251,7 +251,7 @@
           <w:szCs w:val="24"/>
           <w:rtl w:val="false"/>
         </w:rPr>
-        <w:t xml:space="preserve"> PostgreSQL, MySQL, Elasticsearch, queues, AWS EventBridge, event-driven systems</w:t>
+        <w:t xml:space="preserve"> PostgreSQL, MySQL, RabbitMQ, AWS EventBridge, event-driven design</w:t>
       </w:r>
     </w:p>
     <w:p>
@@ -309,7 +309,7 @@
           <w:szCs w:val="24"/>
           <w:rtl w:val="false"/>
         </w:rPr>
-        <w:t xml:space="preserve"> Prometheus, monitoring and logging, performance optimization, production reliability</w:t>
+        <w:t xml:space="preserve"> Prometheus, observability, performance optimization</w:t>
       </w:r>
     </w:p>
     <w:p>
@@ -404,7 +404,7 @@
           <w:szCs w:val="24"/>
           <w:rtl w:val="false"/>
         </w:rPr>
-        <w:t xml:space="preserve">Owned operation of a Go support platform handling 20,000+ tickets per ordinary month and up to three times that volume in U.S. peak season.</w:t>
+        <w:t xml:space="preserve">Owned operation of a Go support platform handling at least 20,000 tickets per ordinary month and up to three times that volume in U.S. peak season.</w:t>
       </w:r>
     </w:p>
     <w:p>
@@ -425,7 +425,7 @@
           <w:szCs w:val="24"/>
           <w:rtl w:val="false"/>
         </w:rPr>
-        <w:t xml:space="preserve">Engineered a unified API orchestration layer that connected Zendesk, Intercom, and internal services for ticket routing, classification, and lifecycle tracking.</w:t>
+        <w:t xml:space="preserve">Engineered a unified API orchestration layer for ticket routing, classification, and lifecycle tracking across support services.</w:t>
       </w:r>
     </w:p>
     <w:p>
@@ -465,7 +465,7 @@
           <w:szCs w:val="24"/>
           <w:rtl w:val="false"/>
         </w:rPr>
-        <w:t xml:space="preserve">CRURATED — PHP Software Developer, concurrent part-time subcontract / consulting engagement</w:t>
+        <w:t xml:space="preserve">CRURATED — PHP Software Developer (concurrent part-time consultant)</w:t>
       </w:r>
       <w:bookmarkEnd w:id="1"/>
     </w:p>
@@ -521,7 +521,7 @@
           <w:szCs w:val="24"/>
           <w:rtl w:val="false"/>
         </w:rPr>
-        <w:t xml:space="preserve">Architected and led internal event analytics infrastructure used for product metrics, reporting, and business insights.</w:t>
+        <w:t xml:space="preserve">Owned the production Crutrade integration across authentication and OTP, account linking, collection import/export, purchase-ownership checks, and request/response logging.</w:t>
       </w:r>
     </w:p>
     <w:p>
@@ -542,61 +542,7 @@
           <w:szCs w:val="24"/>
           <w:rtl w:val="false"/>
         </w:rPr>
-        <w:t xml:space="preserve">Defined a versioned event schema and routing to Webhook and S3, maintaining cross-team consistency with delivery guarantees and backpressure handling.</w:t>
-      </w:r>
-    </w:p>
-    <w:p>
-      <w:pPr>
-        <w:pStyle w:val="3"/>
-        <w:pStyle w:val="Heading3"/>
-        <w:bidi w:val="false"/>
-        <w:spacing w:after="120" w:before="240"/>
-      </w:pPr>
-      <w:bookmarkStart w:name="_Toc_airSlate_Technical_Lead_Senior_Software__7" w:id="1"/>
-      <w:r>
-        <w:rPr>
-          <w:rFonts w:ascii="Aptos" w:cs="Aptos" w:eastAsia="Aptos" w:hAnsi="Aptos"/>
-          <w:color w:val="000000"/>
-          <w:sz w:val="24"/>
-          <w:szCs w:val="24"/>
-          <w:rtl w:val="false"/>
-        </w:rPr>
-        <w:t xml:space="preserve">airSlate — Technical Lead / Senior Software Developer</w:t>
-      </w:r>
-      <w:bookmarkEnd w:id="1"/>
-    </w:p>
-    <w:p>
-      <w:pPr>
-        <w:bidi w:val="false"/>
-        <w:spacing w:after="120" w:before="120" w:line="259.20000000000005"/>
-        <w:jc w:val="left"/>
-      </w:pPr>
-      <w:r>
-        <w:rPr>
-          <w:rFonts w:ascii="Aptos" w:cs="Aptos" w:eastAsia="Aptos" w:hAnsi="Aptos"/>
-          <w:color w:val="000000"/>
-          <w:sz w:val="24"/>
-          <w:szCs w:val="24"/>
-          <w:rtl w:val="false"/>
-        </w:rPr>
-        <w:t xml:space="preserve">February 2021 – August 2023</w:t>
-      </w:r>
-    </w:p>
-    <w:p>
-      <w:pPr>
-        <w:bidi w:val="false"/>
-        <w:spacing w:after="120" w:before="120" w:line="259.20000000000005"/>
-        <w:jc w:val="left"/>
-      </w:pPr>
-      <w:r>
-        <w:rPr>
-          <w:rFonts w:ascii="Aptos" w:cs="Aptos" w:eastAsia="Aptos" w:hAnsi="Aptos"/>
-          <w:color w:val="000000"/>
-          <w:sz w:val="24"/>
-          <w:szCs w:val="24"/>
-          <w:rtl w:val="false"/>
-        </w:rPr>
-        <w:t xml:space="preserve">Technologies: PHP, Laravel, Symfony, MySQL, Prometheus, REST APIs</w:t>
+        <w:t xml:space="preserve">Maintained event-delivery reliability above 99.9% with fault-tolerant pipelines, retries, and observability.</w:t>
       </w:r>
     </w:p>
     <w:p>
@@ -617,7 +563,7 @@
           <w:szCs w:val="24"/>
           <w:rtl w:val="false"/>
         </w:rPr>
-        <w:t xml:space="preserve">Reduced peak database load by removing bottlenecks and redistributing work, improving service stability during high-traffic periods.</w:t>
+        <w:t xml:space="preserve">Increased DataLake throughput by more than 10x under full technical ownership of the production event-analytics platform.</w:t>
       </w:r>
     </w:p>
     <w:p>
@@ -638,61 +584,7 @@
           <w:szCs w:val="24"/>
           <w:rtl w:val="false"/>
         </w:rPr>
-        <w:t xml:space="preserve">Built a Laravel/Symfony product-wide logger package that followed the interservice communication standard.</w:t>
-      </w:r>
-    </w:p>
-    <w:p>
-      <w:pPr>
-        <w:pStyle w:val="3"/>
-        <w:pStyle w:val="Heading3"/>
-        <w:bidi w:val="false"/>
-        <w:spacing w:after="120" w:before="240"/>
-      </w:pPr>
-      <w:bookmarkStart w:name="_Toc_Hyprr_Technical_Lead_8" w:id="1"/>
-      <w:r>
-        <w:rPr>
-          <w:rFonts w:ascii="Aptos" w:cs="Aptos" w:eastAsia="Aptos" w:hAnsi="Aptos"/>
-          <w:color w:val="000000"/>
-          <w:sz w:val="24"/>
-          <w:szCs w:val="24"/>
-          <w:rtl w:val="false"/>
-        </w:rPr>
-        <w:t xml:space="preserve">Hyprr — Technical Lead</w:t>
-      </w:r>
-      <w:bookmarkEnd w:id="1"/>
-    </w:p>
-    <w:p>
-      <w:pPr>
-        <w:bidi w:val="false"/>
-        <w:spacing w:after="120" w:before="120" w:line="259.20000000000005"/>
-        <w:jc w:val="left"/>
-      </w:pPr>
-      <w:r>
-        <w:rPr>
-          <w:rFonts w:ascii="Aptos" w:cs="Aptos" w:eastAsia="Aptos" w:hAnsi="Aptos"/>
-          <w:color w:val="000000"/>
-          <w:sz w:val="24"/>
-          <w:szCs w:val="24"/>
-          <w:rtl w:val="false"/>
-        </w:rPr>
-        <w:t xml:space="preserve">November 2019 – January 2021</w:t>
-      </w:r>
-    </w:p>
-    <w:p>
-      <w:pPr>
-        <w:bidi w:val="false"/>
-        <w:spacing w:after="120" w:before="120" w:line="259.20000000000005"/>
-        <w:jc w:val="left"/>
-      </w:pPr>
-      <w:r>
-        <w:rPr>
-          <w:rFonts w:ascii="Aptos" w:cs="Aptos" w:eastAsia="Aptos" w:hAnsi="Aptos"/>
-          <w:color w:val="000000"/>
-          <w:sz w:val="24"/>
-          <w:szCs w:val="24"/>
-          <w:rtl w:val="false"/>
-        </w:rPr>
-        <w:t xml:space="preserve">Technologies: PHP, Go, AWS, microservices, CI/CD</w:t>
+        <w:t xml:space="preserve">Delivered parallel event-version publication in production to support analytics consumers during schema migration.</w:t>
       </w:r>
     </w:p>
     <w:p>
@@ -713,7 +605,7 @@
           <w:szCs w:val="24"/>
           <w:rtl w:val="false"/>
         </w:rPr>
-        <w:t xml:space="preserve">Took a Web3 social and NFT product from prototype to closed beta in less than six months, setting its technical roadmap with the CTO.</w:t>
+        <w:t xml:space="preserve">Reduced implementation time for new analytics streams from several days to under 4 hours through modular event-platform design.</w:t>
       </w:r>
     </w:p>
     <w:p>
@@ -723,16 +615,16 @@
         <w:bidi w:val="false"/>
         <w:spacing w:after="120" w:before="240"/>
       </w:pPr>
-      <w:bookmarkStart w:name="_Toc_PDFfiller_Software_Developer_9" w:id="1"/>
-      <w:r>
-        <w:rPr>
-          <w:rFonts w:ascii="Aptos" w:cs="Aptos" w:eastAsia="Aptos" w:hAnsi="Aptos"/>
-          <w:color w:val="000000"/>
-          <w:sz w:val="24"/>
-          <w:szCs w:val="24"/>
-          <w:rtl w:val="false"/>
-        </w:rPr>
-        <w:t xml:space="preserve">PDFfiller — Software Developer</w:t>
+      <w:bookmarkStart w:name="_Toc_airSlate_Programming_Team_Lead_Senior_So_7" w:id="1"/>
+      <w:r>
+        <w:rPr>
+          <w:rFonts w:ascii="Aptos" w:cs="Aptos" w:eastAsia="Aptos" w:hAnsi="Aptos"/>
+          <w:color w:val="000000"/>
+          <w:sz w:val="24"/>
+          <w:szCs w:val="24"/>
+          <w:rtl w:val="false"/>
+        </w:rPr>
+        <w:t xml:space="preserve">airSlate — Programming Team Lead / Senior Software Developer</w:t>
       </w:r>
       <w:bookmarkEnd w:id="1"/>
     </w:p>
@@ -750,24 +642,24 @@
           <w:szCs w:val="24"/>
           <w:rtl w:val="false"/>
         </w:rPr>
-        <w:t xml:space="preserve">October 2016 – November 2019</w:t>
-      </w:r>
-    </w:p>
-    <w:p>
-      <w:pPr>
-        <w:bidi w:val="false"/>
-        <w:spacing w:after="120" w:before="120" w:line="259.20000000000005"/>
-        <w:jc w:val="left"/>
-      </w:pPr>
-      <w:r>
-        <w:rPr>
-          <w:rFonts w:ascii="Aptos" w:cs="Aptos" w:eastAsia="Aptos" w:hAnsi="Aptos"/>
-          <w:color w:val="000000"/>
-          <w:sz w:val="24"/>
-          <w:szCs w:val="24"/>
-          <w:rtl w:val="false"/>
-        </w:rPr>
-        <w:t xml:space="preserve">Technologies: PHP, Laravel, MySQL, RabbitMQ, AWS, email infrastructure</w:t>
+        <w:t xml:space="preserve">February 2021 – August 2023</w:t>
+      </w:r>
+    </w:p>
+    <w:p>
+      <w:pPr>
+        <w:bidi w:val="false"/>
+        <w:spacing w:after="120" w:before="120" w:line="259.20000000000005"/>
+        <w:jc w:val="left"/>
+      </w:pPr>
+      <w:r>
+        <w:rPr>
+          <w:rFonts w:ascii="Aptos" w:cs="Aptos" w:eastAsia="Aptos" w:hAnsi="Aptos"/>
+          <w:color w:val="000000"/>
+          <w:sz w:val="24"/>
+          <w:szCs w:val="24"/>
+          <w:rtl w:val="false"/>
+        </w:rPr>
+        <w:t xml:space="preserve">Technologies: PHP, Laravel, Symfony, MySQL, Prometheus, REST APIs</w:t>
       </w:r>
     </w:p>
     <w:p>
@@ -788,7 +680,7 @@
           <w:szCs w:val="24"/>
           <w:rtl w:val="false"/>
         </w:rPr>
-        <w:t xml:space="preserve">Led five backend engineers developing a transactional email service that handled about 3 million emails in an ordinary month.</w:t>
+        <w:t xml:space="preserve">Reduced peak load on the main database by removing bottlenecks and redistributing work, improving service stability during high-traffic periods.</w:t>
       </w:r>
     </w:p>
     <w:p>
@@ -809,7 +701,49 @@
           <w:szCs w:val="24"/>
           <w:rtl w:val="false"/>
         </w:rPr>
-        <w:t xml:space="preserve">Guided the transactional-email team through BFCM periods at up to ten times ordinary-month volume.</w:t>
+        <w:t xml:space="preserve">Built a Laravel/Symfony product-wide logger package that followed the interservice communication standard.</w:t>
+      </w:r>
+    </w:p>
+    <w:p>
+      <w:pPr>
+        <w:pStyle w:val="ListParagraph"/>
+        <w:numPr>
+          <w:ilvl w:val="0"/>
+          <w:numId w:val="1"/>
+        </w:numPr>
+        <w:bidi w:val="false"/>
+        <w:spacing w:after="60" w:before="60"/>
+      </w:pPr>
+      <w:r>
+        <w:rPr>
+          <w:rFonts w:ascii="Aptos" w:cs="Aptos" w:eastAsia="Aptos" w:hAnsi="Aptos"/>
+          <w:color w:val="000000"/>
+          <w:sz w:val="24"/>
+          <w:szCs w:val="24"/>
+          <w:rtl w:val="false"/>
+        </w:rPr>
+        <w:t xml:space="preserve">Turned epics and technical debt into owned release work through decomposition, delegation, and backlog planning with the engineering team.</w:t>
+      </w:r>
+    </w:p>
+    <w:p>
+      <w:pPr>
+        <w:pStyle w:val="ListParagraph"/>
+        <w:numPr>
+          <w:ilvl w:val="0"/>
+          <w:numId w:val="1"/>
+        </w:numPr>
+        <w:bidi w:val="false"/>
+        <w:spacing w:after="60" w:before="60"/>
+      </w:pPr>
+      <w:r>
+        <w:rPr>
+          <w:rFonts w:ascii="Aptos" w:cs="Aptos" w:eastAsia="Aptos" w:hAnsi="Aptos"/>
+          <w:color w:val="000000"/>
+          <w:sz w:val="24"/>
+          <w:szCs w:val="24"/>
+          <w:rtl w:val="false"/>
+        </w:rPr>
+        <w:t xml:space="preserve">Resolved production issues using logs, monitoring, and SRE dashboards, delivering fixes through on-call investigation.</w:t>
       </w:r>
     </w:p>
     <w:p>
@@ -819,7 +753,7 @@
         <w:bidi w:val="false"/>
         <w:spacing w:after="120" w:before="240"/>
       </w:pPr>
-      <w:bookmarkStart w:name="_Toc_Education_10" w:id="1"/>
+      <w:bookmarkStart w:name="_Toc_Earlier_Experience_8" w:id="1"/>
       <w:r>
         <w:rPr>
           <w:rFonts w:ascii="Aptos" w:cs="Aptos" w:eastAsia="Aptos" w:hAnsi="Aptos"/>
@@ -828,7 +762,7 @@
           <w:szCs w:val="28"/>
           <w:rtl w:val="false"/>
         </w:rPr>
-        <w:t xml:space="preserve">Education</w:t>
+        <w:t xml:space="preserve">Earlier Experience</w:t>
       </w:r>
       <w:bookmarkEnd w:id="1"/>
     </w:p>
@@ -846,7 +780,24 @@
           <w:szCs w:val="24"/>
           <w:rtl w:val="false"/>
         </w:rPr>
-        <w:t xml:space="preserve">Master of Computer Applications, National Technical University "Kharkiv Polytechnic Institute", 2003–2008</w:t>
+        <w:t xml:space="preserve">Hyprr — Technical Lead, 2019–2021: guided a Web3 social and NFT product from prototype to closed beta in less than six months.</w:t>
+      </w:r>
+    </w:p>
+    <w:p>
+      <w:pPr>
+        <w:bidi w:val="false"/>
+        <w:spacing w:after="120" w:before="120" w:line="259.20000000000005"/>
+        <w:jc w:val="left"/>
+      </w:pPr>
+      <w:r>
+        <w:rPr>
+          <w:rFonts w:ascii="Aptos" w:cs="Aptos" w:eastAsia="Aptos" w:hAnsi="Aptos"/>
+          <w:color w:val="000000"/>
+          <w:sz w:val="24"/>
+          <w:szCs w:val="24"/>
+          <w:rtl w:val="false"/>
+        </w:rPr>
+        <w:t xml:space="preserve">PDFfiller — Software Developer, 2016–2019: led five backend engineers on a transactional email service handling about 3 million emails in an ordinary month and up to 10x volume during BFCM.</w:t>
       </w:r>
     </w:p>
     <w:p>
@@ -856,7 +807,44 @@
         <w:bidi w:val="false"/>
         <w:spacing w:after="120" w:before="240"/>
       </w:pPr>
-      <w:bookmarkStart w:name="_Toc_Languages_11" w:id="1"/>
+      <w:bookmarkStart w:name="_Toc_Education_9" w:id="1"/>
+      <w:r>
+        <w:rPr>
+          <w:rFonts w:ascii="Aptos" w:cs="Aptos" w:eastAsia="Aptos" w:hAnsi="Aptos"/>
+          <w:color w:val="000000"/>
+          <w:sz w:val="28"/>
+          <w:szCs w:val="28"/>
+          <w:rtl w:val="false"/>
+        </w:rPr>
+        <w:t xml:space="preserve">Education</w:t>
+      </w:r>
+      <w:bookmarkEnd w:id="1"/>
+    </w:p>
+    <w:p>
+      <w:pPr>
+        <w:bidi w:val="false"/>
+        <w:spacing w:after="120" w:before="120" w:line="259.20000000000005"/>
+        <w:jc w:val="left"/>
+      </w:pPr>
+      <w:r>
+        <w:rPr>
+          <w:rFonts w:ascii="Aptos" w:cs="Aptos" w:eastAsia="Aptos" w:hAnsi="Aptos"/>
+          <w:color w:val="000000"/>
+          <w:sz w:val="24"/>
+          <w:szCs w:val="24"/>
+          <w:rtl w:val="false"/>
+        </w:rPr>
+        <w:t xml:space="preserve">Master of Computer Applications, National Technical University "Kharkiv Polytechnic Institute", 2003–2008</w:t>
+      </w:r>
+    </w:p>
+    <w:p>
+      <w:pPr>
+        <w:pStyle w:val="2"/>
+        <w:pStyle w:val="Heading2"/>
+        <w:bidi w:val="false"/>
+        <w:spacing w:after="120" w:before="240"/>
+      </w:pPr>
+      <w:bookmarkStart w:name="_Toc_Languages_10" w:id="1"/>
       <w:r>
         <w:rPr>
           <w:rFonts w:ascii="Aptos" w:cs="Aptos" w:eastAsia="Aptos" w:hAnsi="Aptos"/>

</xml_diff>